<commit_message>
lab 12 report done
</commit_message>
<xml_diff>
--- a/src/12/Лаб_12_Вайцеховский.docx
+++ b/src/12/Лаб_12_Вайцеховский.docx
@@ -144,7 +144,16 @@
           <w:szCs w:val="28"/>
           <w:lang w:eastAsia="ru-RU"/>
         </w:rPr>
-        <w:t>10</w:t>
+        <w:t>1</w:t>
+      </w:r>
+      <w:r>
+        <w:rPr>
+          <w:rFonts w:eastAsia="DengXian" w:cs="Times New Roman"/>
+          <w:b/>
+          <w:szCs w:val="28"/>
+          <w:lang w:eastAsia="ru-RU"/>
+        </w:rPr>
+        <w:t>2</w:t>
       </w:r>
       <w:r>
         <w:rPr>
@@ -380,7 +389,25 @@
           <w:szCs w:val="28"/>
           <w:lang w:eastAsia="ru-RU"/>
         </w:rPr>
-        <w:t xml:space="preserve">Принял преподаватель   _____________ А.В. </w:t>
+        <w:t xml:space="preserve">Принял преподаватель   _____________ </w:t>
+      </w:r>
+      <w:proofErr w:type="gramStart"/>
+      <w:r>
+        <w:rPr>
+          <w:rFonts w:eastAsia="DengXian" w:cs="Times New Roman"/>
+          <w:szCs w:val="28"/>
+          <w:lang w:eastAsia="ru-RU"/>
+        </w:rPr>
+        <w:t>А.В.</w:t>
+      </w:r>
+      <w:proofErr w:type="gramEnd"/>
+      <w:r>
+        <w:rPr>
+          <w:rFonts w:eastAsia="DengXian" w:cs="Times New Roman"/>
+          <w:szCs w:val="28"/>
+          <w:lang w:eastAsia="ru-RU"/>
+        </w:rPr>
+        <w:t xml:space="preserve"> </w:t>
       </w:r>
       <w:r>
         <w:rPr>
@@ -457,15 +484,34 @@
           <w:u w:val="single"/>
           <w:lang w:eastAsia="ru-RU"/>
         </w:rPr>
-        <w:t xml:space="preserve">      </w:t>
-      </w:r>
+        <w:t xml:space="preserve">    </w:t>
+      </w:r>
+      <w:proofErr w:type="gramStart"/>
       <w:r>
         <w:rPr>
           <w:rFonts w:eastAsia="DengXian" w:cs="Times New Roman"/>
           <w:szCs w:val="28"/>
+          <w:u w:val="single"/>
           <w:lang w:eastAsia="ru-RU"/>
         </w:rPr>
-        <w:t xml:space="preserve">” </w:t>
+        <w:t xml:space="preserve">  </w:t>
+      </w:r>
+      <w:r>
+        <w:rPr>
+          <w:rFonts w:eastAsia="DengXian" w:cs="Times New Roman"/>
+          <w:szCs w:val="28"/>
+          <w:lang w:eastAsia="ru-RU"/>
+        </w:rPr>
+        <w:t>”</w:t>
+      </w:r>
+      <w:proofErr w:type="gramEnd"/>
+      <w:r>
+        <w:rPr>
+          <w:rFonts w:eastAsia="DengXian" w:cs="Times New Roman"/>
+          <w:szCs w:val="28"/>
+          <w:lang w:eastAsia="ru-RU"/>
+        </w:rPr>
+        <w:t xml:space="preserve"> </w:t>
       </w:r>
       <w:r>
         <w:rPr>
@@ -614,7 +660,7 @@
           <w:bCs/>
           <w:szCs w:val="28"/>
         </w:rPr>
-        <w:t xml:space="preserve">1. Реализовать алгоритм решения задания с использованием функций коллективного обмена в MPI, замерить время выполнения программы, если возможно, вычислить эффективность. </w:t>
+        <w:t xml:space="preserve">1. Разработать алгоритм решения задания параллельный по данным. </w:t>
       </w:r>
     </w:p>
     <w:p>
@@ -631,7 +677,7 @@
           <w:bCs/>
           <w:szCs w:val="28"/>
         </w:rPr>
-        <w:t xml:space="preserve">2. Реализовать алгоритм решения задания с использованием функций двухточечного обмена в MPI. Отладить программу. Замерить время выполнения программы, если возможно, вычислить эффективность. </w:t>
+        <w:t xml:space="preserve">2. Реализовать алгоритм решения задания с использованием функций MPI. Отладить программу на нескольких примерах. </w:t>
       </w:r>
     </w:p>
     <w:p>
@@ -648,7 +694,7 @@
           <w:bCs/>
           <w:szCs w:val="28"/>
         </w:rPr>
-        <w:t xml:space="preserve">3. Сравнить эффективность реализаций, построить графики, сделать выводы. </w:t>
+        <w:t xml:space="preserve">3. Замерить время выполнения программы, для разного количества процессоров и разной размерности данных. Вычислить эффективность, построить графики, сделать выводы. </w:t>
       </w:r>
     </w:p>
     <w:p>
@@ -661,7 +707,31 @@
         <w:rPr>
           <w:lang w:eastAsia="ru-RU"/>
         </w:rPr>
-        <w:t xml:space="preserve">Код итоговой программы представлен в файле: </w:t>
+        <w:t xml:space="preserve">Код </w:t>
+      </w:r>
+      <w:r>
+        <w:rPr>
+          <w:lang w:eastAsia="ru-RU"/>
+        </w:rPr>
+        <w:t>итоговых программ</w:t>
+      </w:r>
+      <w:r>
+        <w:rPr>
+          <w:lang w:eastAsia="ru-RU"/>
+        </w:rPr>
+        <w:t xml:space="preserve"> представлен в файл</w:t>
+      </w:r>
+      <w:r>
+        <w:rPr>
+          <w:lang w:eastAsia="ru-RU"/>
+        </w:rPr>
+        <w:t>ах</w:t>
+      </w:r>
+      <w:r>
+        <w:rPr>
+          <w:lang w:eastAsia="ru-RU"/>
+        </w:rPr>
+        <w:t xml:space="preserve">: </w:t>
       </w:r>
     </w:p>
     <w:p>
@@ -674,357 +744,655 @@
         <w:r>
           <w:rPr>
             <w:rStyle w:val="a4"/>
-            <w:lang w:val="en-US"/>
           </w:rPr>
-          <w:t>https</w:t>
+          <w:t>https://github.com/Vaytsekhovskiy/Supercomputers-and-high-performance-computing/blob/master/src/12/prepare_data.c</w:t>
         </w:r>
+      </w:hyperlink>
+    </w:p>
+    <w:p>
+      <w:r>
+        <w:t>И</w:t>
+      </w:r>
+    </w:p>
+    <w:p>
+      <w:hyperlink r:id="rId9" w:history="1">
         <w:r>
           <w:rPr>
             <w:rStyle w:val="a4"/>
           </w:rPr>
-          <w:t>://</w:t>
-        </w:r>
-        <w:proofErr w:type="spellStart"/>
-        <w:r>
-          <w:rPr>
-            <w:rStyle w:val="a4"/>
-            <w:lang w:val="en-US"/>
-          </w:rPr>
-          <w:t>github</w:t>
-        </w:r>
-        <w:proofErr w:type="spellEnd"/>
-        <w:r>
-          <w:rPr>
-            <w:rStyle w:val="a4"/>
-          </w:rPr>
-          <w:t>.</w:t>
-        </w:r>
-        <w:r>
-          <w:rPr>
-            <w:rStyle w:val="a4"/>
-            <w:lang w:val="en-US"/>
-          </w:rPr>
-          <w:t>com</w:t>
-        </w:r>
-        <w:r>
-          <w:rPr>
-            <w:rStyle w:val="a4"/>
-          </w:rPr>
-          <w:t>/</w:t>
-        </w:r>
-        <w:proofErr w:type="spellStart"/>
-        <w:r>
-          <w:rPr>
-            <w:rStyle w:val="a4"/>
-            <w:lang w:val="en-US"/>
-          </w:rPr>
-          <w:t>Vaytsekhovskiy</w:t>
-        </w:r>
-        <w:proofErr w:type="spellEnd"/>
-        <w:r>
-          <w:rPr>
-            <w:rStyle w:val="a4"/>
-          </w:rPr>
-          <w:t>/</w:t>
-        </w:r>
-        <w:r>
-          <w:rPr>
-            <w:rStyle w:val="a4"/>
-            <w:lang w:val="en-US"/>
-          </w:rPr>
-          <w:t>Supercomputers</w:t>
-        </w:r>
-        <w:r>
-          <w:rPr>
-            <w:rStyle w:val="a4"/>
-          </w:rPr>
-          <w:t>-</w:t>
-        </w:r>
-        <w:r>
-          <w:rPr>
-            <w:rStyle w:val="a4"/>
-            <w:lang w:val="en-US"/>
-          </w:rPr>
-          <w:t>and</w:t>
-        </w:r>
-        <w:r>
-          <w:rPr>
-            <w:rStyle w:val="a4"/>
-          </w:rPr>
-          <w:t>-</w:t>
-        </w:r>
-        <w:r>
-          <w:rPr>
-            <w:rStyle w:val="a4"/>
-            <w:lang w:val="en-US"/>
-          </w:rPr>
-          <w:t>high</w:t>
-        </w:r>
-        <w:r>
-          <w:rPr>
-            <w:rStyle w:val="a4"/>
-          </w:rPr>
-          <w:t>-</w:t>
-        </w:r>
-        <w:r>
-          <w:rPr>
-            <w:rStyle w:val="a4"/>
-            <w:lang w:val="en-US"/>
-          </w:rPr>
-          <w:t>performance</w:t>
-        </w:r>
-        <w:r>
-          <w:rPr>
-            <w:rStyle w:val="a4"/>
-          </w:rPr>
-          <w:t>-</w:t>
-        </w:r>
-        <w:r>
-          <w:rPr>
-            <w:rStyle w:val="a4"/>
-            <w:lang w:val="en-US"/>
-          </w:rPr>
-          <w:t>computing</w:t>
-        </w:r>
-        <w:r>
-          <w:rPr>
-            <w:rStyle w:val="a4"/>
-          </w:rPr>
-          <w:t>/</w:t>
-        </w:r>
-        <w:r>
-          <w:rPr>
-            <w:rStyle w:val="a4"/>
-            <w:lang w:val="en-US"/>
-          </w:rPr>
-          <w:t>blob</w:t>
-        </w:r>
-        <w:r>
-          <w:rPr>
-            <w:rStyle w:val="a4"/>
-          </w:rPr>
-          <w:t>/</w:t>
-        </w:r>
-        <w:r>
-          <w:rPr>
-            <w:rStyle w:val="a4"/>
-            <w:lang w:val="en-US"/>
-          </w:rPr>
-          <w:t>master</w:t>
-        </w:r>
-        <w:r>
-          <w:rPr>
-            <w:rStyle w:val="a4"/>
-          </w:rPr>
-          <w:t>/</w:t>
-        </w:r>
-        <w:proofErr w:type="spellStart"/>
-        <w:r>
-          <w:rPr>
-            <w:rStyle w:val="a4"/>
-            <w:lang w:val="en-US"/>
-          </w:rPr>
-          <w:t>src</w:t>
-        </w:r>
-        <w:proofErr w:type="spellEnd"/>
-        <w:r>
-          <w:rPr>
-            <w:rStyle w:val="a4"/>
-          </w:rPr>
-          <w:t>/10/10_3.</w:t>
-        </w:r>
-        <w:r>
-          <w:rPr>
-            <w:rStyle w:val="a4"/>
-            <w:lang w:val="en-US"/>
-          </w:rPr>
-          <w:t>c</w:t>
+          <w:t>https://github.com/Vaytsekhovskiy/Supercomputers-and-high-performance-computing/blob/master/src/12/12_3.c</w:t>
         </w:r>
       </w:hyperlink>
     </w:p>
     <w:p>
-      <w:r>
-        <w:t xml:space="preserve">В данной задаче необходимо реализовать рассылку значения </w:t>
-      </w:r>
-      <w:r>
+      <w:pPr>
+        <w:rPr>
+          <w:b/>
+          <w:bCs/>
+        </w:rPr>
+      </w:pPr>
+      <w:r>
+        <w:rPr>
+          <w:b/>
+          <w:bCs/>
+        </w:rPr>
+        <w:t>Программа подготовки данных</w:t>
+      </w:r>
+    </w:p>
+    <w:p>
+      <w:pPr>
         <w:rPr>
           <w:lang w:val="en-US"/>
         </w:rPr>
-        <w:t>n</w:t>
-      </w:r>
-      <w:r>
-        <w:t xml:space="preserve"> от корневого процесса</w:t>
-      </w:r>
-    </w:p>
-    <w:p>
-      <w:pPr>
+      </w:pPr>
+      <w:r>
+        <w:t>1) Генерирует случайную матрицу A размера m x n и вектор x размера n.</w:t>
+      </w:r>
+      <w:r>
+        <w:br/>
+        <w:t>2) Делит матрицу A на p блоков строк (</w:t>
+      </w:r>
+      <w:proofErr w:type="spellStart"/>
+      <w:r>
+        <w:t>block</w:t>
+      </w:r>
+      <w:proofErr w:type="spellEnd"/>
+      <w:r>
+        <w:t>-распределение) -</w:t>
+      </w:r>
+      <w:r>
+        <w:br/>
+        <w:t xml:space="preserve">   так, как её потом будут независимо читать p MPI-процессов.</w:t>
+      </w:r>
+      <w:r>
+        <w:br/>
+        <w:t>3) Записывает данные на диск в текстовые файлы:</w:t>
+      </w:r>
+      <w:r>
+        <w:br/>
+        <w:t xml:space="preserve">     vector_m{m}_n{n}_p{p}.txt        - вектор x (общий для всех процессов)</w:t>
+      </w:r>
+      <w:r>
+        <w:br/>
+        <w:t xml:space="preserve">     part_m{m}_n{n}_p{p}_r{rank}.txt  - своя часть матрицы A для процесса </w:t>
+      </w:r>
+      <w:proofErr w:type="spellStart"/>
+      <w:r>
+        <w:t>rank</w:t>
+      </w:r>
+      <w:proofErr w:type="spellEnd"/>
+      <w:r>
+        <w:br/>
+        <w:t xml:space="preserve">     expected_m{m}_n{n}_p{p}.txt      - эталонный результат y, посчитанный</w:t>
+      </w:r>
+      <w:r>
+        <w:t xml:space="preserve"> </w:t>
+      </w:r>
+      <w:r>
+        <w:t>последовательно (для проверки корректности)</w:t>
+      </w:r>
+      <w:r>
+        <w:br/>
+      </w:r>
+      <w:r>
+        <w:br/>
+        <w:t>Как правильно поделить m строк на p процессов почти поровну:</w:t>
+      </w:r>
+      <w:r>
+        <w:br/>
+        <w:t xml:space="preserve">    </w:t>
+      </w:r>
+      <w:proofErr w:type="spellStart"/>
+      <w:r>
+        <w:t>base</w:t>
+      </w:r>
+      <w:proofErr w:type="spellEnd"/>
+      <w:r>
+        <w:t xml:space="preserve"> = m / p          - целая часть</w:t>
+      </w:r>
+      <w:r>
+        <w:br/>
+        <w:t xml:space="preserve">    </w:t>
+      </w:r>
+      <w:proofErr w:type="spellStart"/>
+      <w:r>
+        <w:t>rem</w:t>
+      </w:r>
+      <w:proofErr w:type="spellEnd"/>
+      <w:r>
+        <w:t xml:space="preserve">  = m % p          - остаток</w:t>
+      </w:r>
+      <w:r>
+        <w:br/>
+        <w:t xml:space="preserve">    Первые `</w:t>
+      </w:r>
+      <w:proofErr w:type="spellStart"/>
+      <w:r>
+        <w:t>rem</w:t>
+      </w:r>
+      <w:proofErr w:type="spellEnd"/>
+      <w:r>
+        <w:t>` процессов получают (</w:t>
+      </w:r>
+      <w:proofErr w:type="spellStart"/>
+      <w:r>
+        <w:t>base</w:t>
+      </w:r>
+      <w:proofErr w:type="spellEnd"/>
+      <w:r>
+        <w:t xml:space="preserve"> + 1) строк,</w:t>
+      </w:r>
+      <w:r>
+        <w:br/>
+        <w:t xml:space="preserve">    остальные -- ровно `</w:t>
+      </w:r>
+      <w:proofErr w:type="spellStart"/>
+      <w:r>
+        <w:t>base</w:t>
+      </w:r>
+      <w:proofErr w:type="spellEnd"/>
+      <w:r>
+        <w:t>` строк.</w:t>
+      </w:r>
+      <w:r>
+        <w:br/>
+      </w:r>
+      <w:r>
+        <w:lastRenderedPageBreak/>
+        <w:t xml:space="preserve"> Это гарантирует, что разница в нагрузке между процессами не превышает 1 строку.</w:t>
+      </w:r>
+      <w:r>
+        <w:br/>
+      </w:r>
+      <w:r>
+        <w:br/>
+        <w:t>Запуск</w:t>
+      </w:r>
+      <w:r>
         <w:rPr>
           <w:lang w:val="en-US"/>
         </w:rPr>
-      </w:pPr>
-      <w:r>
-        <w:t xml:space="preserve">    ко всем остальным процессам двумя способами:</w:t>
-      </w:r>
-    </w:p>
-    <w:p>
-      <w:r>
-        <w:t xml:space="preserve">    1) вручную, с помощью двухточечных обменов </w:t>
+        <w:t>:</w:t>
       </w:r>
       <w:r>
         <w:rPr>
           <w:lang w:val="en-US"/>
         </w:rPr>
-        <w:t>MPI</w:t>
-      </w:r>
-      <w:r>
-        <w:t>_</w:t>
+        <w:br/>
+        <w:t xml:space="preserve">    prepare_data.exe &lt;m&gt; &lt;n&gt; &lt;p&gt; [seed]</w:t>
       </w:r>
       <w:r>
         <w:rPr>
           <w:lang w:val="en-US"/>
         </w:rPr>
-        <w:t>Send</w:t>
-      </w:r>
-      <w:r>
-        <w:t xml:space="preserve"> / </w:t>
+        <w:br/>
       </w:r>
       <w:r>
         <w:rPr>
           <w:lang w:val="en-US"/>
         </w:rPr>
-        <w:t>MPI</w:t>
-      </w:r>
-      <w:r>
-        <w:t>_</w:t>
+        <w:br/>
+      </w:r>
+      <w:r>
+        <w:t>Пример</w:t>
+      </w:r>
+      <w:r>
+        <w:rPr>
+          <w:lang w:val="en-US"/>
+        </w:rPr>
+        <w:t>:</w:t>
+      </w:r>
+      <w:r>
+        <w:rPr>
+          <w:lang w:val="en-US"/>
+        </w:rPr>
+        <w:br/>
+        <w:t xml:space="preserve">    prepare_data.exe 1000 1000 4</w:t>
+      </w:r>
+    </w:p>
+    <w:p>
+      <w:pPr>
+        <w:rPr>
+          <w:b/>
+          <w:bCs/>
+        </w:rPr>
+      </w:pPr>
+      <w:r>
+        <w:rPr>
+          <w:b/>
+          <w:bCs/>
+        </w:rPr>
+        <w:t xml:space="preserve">Программа для вычисления произведения </w:t>
+      </w:r>
+      <w:r>
+        <w:rPr>
+          <w:b/>
+          <w:bCs/>
+          <w:lang w:val="en-US"/>
+        </w:rPr>
+        <w:t>Ax</w:t>
+      </w:r>
+      <w:r>
+        <w:rPr>
+          <w:b/>
+          <w:bCs/>
+        </w:rPr>
+        <w:t xml:space="preserve"> </w:t>
+      </w:r>
+      <w:r>
+        <w:rPr>
+          <w:b/>
+          <w:bCs/>
+        </w:rPr>
+        <w:t xml:space="preserve">как </w:t>
+      </w:r>
+      <w:r>
+        <w:rPr>
+          <w:b/>
+          <w:bCs/>
+          <w:lang w:val="en-US"/>
+        </w:rPr>
+        <w:t>m</w:t>
+      </w:r>
+      <w:r>
+        <w:rPr>
+          <w:b/>
+          <w:bCs/>
+        </w:rPr>
+        <w:t xml:space="preserve"> скалярных произведений</w:t>
+      </w:r>
+    </w:p>
+    <w:p>
+      <w:r>
+        <w:t xml:space="preserve">- Матрица A заранее (программой </w:t>
       </w:r>
       <w:proofErr w:type="spellStart"/>
       <w:r>
-        <w:rPr>
-          <w:lang w:val="en-US"/>
-        </w:rPr>
-        <w:t>Recv</w:t>
+        <w:t>prepare_data</w:t>
       </w:r>
       <w:proofErr w:type="spellEnd"/>
       <w:r>
-        <w:t>;</w:t>
-      </w:r>
-    </w:p>
-    <w:p>
-      <w:r>
-        <w:t xml:space="preserve">    2) с помощью коллективной функции </w:t>
-      </w:r>
-      <w:r>
-        <w:rPr>
-          <w:lang w:val="en-US"/>
-        </w:rPr>
-        <w:t>MPI</w:t>
-      </w:r>
-      <w:r>
-        <w:t>_</w:t>
+        <w:t>) разбита на p блоков строк</w:t>
+      </w:r>
+      <w:r>
+        <w:br/>
+        <w:t xml:space="preserve">  и разложена по отдельным файлам - </w:t>
       </w:r>
       <w:proofErr w:type="spellStart"/>
       <w:r>
-        <w:rPr>
-          <w:lang w:val="en-US"/>
-        </w:rPr>
-        <w:t>Bcast</w:t>
+        <w:t>part</w:t>
       </w:r>
       <w:proofErr w:type="spellEnd"/>
       <w:r>
-        <w:t>().</w:t>
-      </w:r>
-    </w:p>
-    <w:p>
-      <w:r>
-        <w:t>После этого сравниваются времена выполнения этих двух способов.</w:t>
-      </w:r>
-    </w:p>
-    <w:p>
-      <w:r>
-        <w:t xml:space="preserve">Это позволяет оценить, насколько оптимизирована библиотечная функция </w:t>
-      </w:r>
-      <w:r>
-        <w:rPr>
-          <w:lang w:val="en-US"/>
-        </w:rPr>
-        <w:t>MPI</w:t>
-      </w:r>
-      <w:r>
-        <w:t>_</w:t>
+        <w:t xml:space="preserve">_..._r0.txt, </w:t>
       </w:r>
       <w:proofErr w:type="spellStart"/>
       <w:r>
-        <w:rPr>
-          <w:lang w:val="en-US"/>
-        </w:rPr>
-        <w:t>Bcast</w:t>
+        <w:t>part</w:t>
       </w:r>
       <w:proofErr w:type="spellEnd"/>
       <w:r>
+        <w:t>_..._r1.txt и т.д.</w:t>
+      </w:r>
+      <w:r>
+        <w:br/>
+        <w:t xml:space="preserve">- Каждый MPI-процесс с номером </w:t>
+      </w:r>
+      <w:proofErr w:type="spellStart"/>
+      <w:r>
+        <w:t>rank</w:t>
+      </w:r>
+      <w:proofErr w:type="spellEnd"/>
+      <w:r>
+        <w:t xml:space="preserve"> читает СВОЙ файл </w:t>
+      </w:r>
+      <w:proofErr w:type="spellStart"/>
+      <w:r>
+        <w:t>part</w:t>
+      </w:r>
+      <w:proofErr w:type="spellEnd"/>
+      <w:r>
+        <w:t>_..._r{rank}.txt</w:t>
+      </w:r>
+      <w:r>
+        <w:br/>
+        <w:t xml:space="preserve">  и общий файл с вектором x.</w:t>
+      </w:r>
+      <w:r>
+        <w:br/>
+        <w:t>- Каждый процесс независимо вычисляет свою часть результата:</w:t>
+      </w:r>
+      <w:r>
+        <w:br/>
+        <w:t xml:space="preserve">  скалярные произведения "своих" строк матрицы на вектор x.</w:t>
+      </w:r>
+      <w:r>
+        <w:br/>
+        <w:t xml:space="preserve">  Это не требует никакого обмена данными между процессами во время счёта --</w:t>
+      </w:r>
+      <w:r>
+        <w:br/>
+        <w:t xml:space="preserve">  каждая строка обрабатывается полностью независимо от остальных.</w:t>
+      </w:r>
+      <w:r>
+        <w:br/>
+        <w:t>- В конце все процессы передают свои куски результата на процесс 0</w:t>
+      </w:r>
+      <w:r>
+        <w:br/>
+        <w:t xml:space="preserve">  с помощью </w:t>
+      </w:r>
+      <w:proofErr w:type="spellStart"/>
+      <w:r>
+        <w:t>MPI_Gatherv</w:t>
+      </w:r>
+      <w:proofErr w:type="spellEnd"/>
+      <w:r>
+        <w:t xml:space="preserve"> (</w:t>
+      </w:r>
+      <w:proofErr w:type="spellStart"/>
+      <w:r>
+        <w:t>Gatherv</w:t>
+      </w:r>
+      <w:proofErr w:type="spellEnd"/>
+      <w:r>
+        <w:t xml:space="preserve"> -- потому что число строк у процессов</w:t>
+      </w:r>
+      <w:r>
+        <w:br/>
+        <w:t xml:space="preserve">  может отличаться на 1, если m не делится на p нацело).</w:t>
+      </w:r>
+      <w:r>
+        <w:br/>
+        <w:t>- Процесс 0 сохраняет итоговый вектор y и печатает время выполнения.</w:t>
+      </w:r>
+      <w:r>
+        <w:br/>
+      </w:r>
+      <w:r>
+        <w:br/>
+      </w:r>
+      <w:r>
+        <w:t>Итого, ф</w:t>
+      </w:r>
+      <w:r>
+        <w:t>ормула распределения строк по процессам (</w:t>
+      </w:r>
+      <w:proofErr w:type="spellStart"/>
+      <w:r>
+        <w:t>base</w:t>
+      </w:r>
+      <w:proofErr w:type="spellEnd"/>
+      <w:r>
+        <w:t>/</w:t>
+      </w:r>
+      <w:proofErr w:type="spellStart"/>
+      <w:r>
+        <w:t>rem</w:t>
+      </w:r>
+      <w:proofErr w:type="spellEnd"/>
+      <w:r>
+        <w:t>) здесь</w:t>
+      </w:r>
+      <w:r>
+        <w:br/>
+        <w:t xml:space="preserve">ДОЛЖНА СОВПАДАТЬ с формулой в </w:t>
+      </w:r>
+      <w:proofErr w:type="spellStart"/>
+      <w:r>
+        <w:t>prepare_data.c</w:t>
+      </w:r>
+      <w:proofErr w:type="spellEnd"/>
+      <w:r>
+        <w:t>, иначе процесс прочитает</w:t>
+      </w:r>
+      <w:r>
+        <w:br/>
+        <w:t xml:space="preserve">файл с одним числом строк, а </w:t>
+      </w:r>
+      <w:proofErr w:type="spellStart"/>
+      <w:r>
+        <w:t>Gatherv</w:t>
+      </w:r>
+      <w:proofErr w:type="spellEnd"/>
+      <w:r>
+        <w:t xml:space="preserve"> будет ждать другое количество.</w:t>
+      </w:r>
+      <w:r>
+        <w:br/>
+        <w:t>Совпадение гарантируется тем, что обе программы используют одну и ту же</w:t>
+      </w:r>
+      <w:r>
+        <w:br/>
+        <w:t>математическую формулу деления m на p</w:t>
+      </w:r>
+      <w:r>
+        <w:t>.</w:t>
+      </w:r>
+      <w:r>
+        <w:br/>
+      </w:r>
+      <w:r>
+        <w:br/>
+        <w:t>Запуск:</w:t>
+      </w:r>
+      <w:r>
+        <w:br/>
+        <w:t xml:space="preserve">    </w:t>
+      </w:r>
+      <w:proofErr w:type="spellStart"/>
+      <w:r>
+        <w:t>mpiexec</w:t>
+      </w:r>
+      <w:proofErr w:type="spellEnd"/>
+      <w:r>
+        <w:t xml:space="preserve"> -n &lt;p&gt; 12_3.exe &lt;m&gt; &lt;n&gt; &lt;p&gt;</w:t>
+      </w:r>
+      <w:r>
+        <w:br/>
+      </w:r>
+      <w:r>
+        <w:br/>
+      </w:r>
+      <w:r>
+        <w:lastRenderedPageBreak/>
+        <w:t>Пример:</w:t>
+      </w:r>
+      <w:r>
+        <w:br/>
+        <w:t xml:space="preserve">    </w:t>
+      </w:r>
+      <w:proofErr w:type="spellStart"/>
+      <w:r>
+        <w:t>mpiexec</w:t>
+      </w:r>
+      <w:proofErr w:type="spellEnd"/>
+      <w:r>
+        <w:t xml:space="preserve"> -n 3 12_3.exe 6 4 3</w:t>
+      </w:r>
+    </w:p>
+    <w:p>
+      <w:pPr>
+        <w:rPr>
+          <w:b/>
+          <w:bCs/>
+        </w:rPr>
+      </w:pPr>
+    </w:p>
+    <w:p>
+      <w:r>
+        <w:t xml:space="preserve">Итоговый вывод программы на разных количествах процессов представлен в конце файла. </w:t>
+      </w:r>
+    </w:p>
+    <w:p>
+      <w:pPr>
+        <w:rPr>
+          <w:b/>
+          <w:bCs/>
+        </w:rPr>
+      </w:pPr>
+      <w:r>
+        <w:rPr>
+          <w:b/>
+          <w:bCs/>
+        </w:rPr>
+        <w:t>Проверка данных</w:t>
+      </w:r>
+    </w:p>
+    <w:p>
+      <w:r>
+        <w:t>Перед вычислением метрик были проведены четыре группы тестов, каждая из которых проверяет свой аспект программы.</w:t>
+      </w:r>
+    </w:p>
+    <w:p>
+      <w:r>
+        <w:t xml:space="preserve">Тест 1 (m=6, n=4, p=3) — минимальный пример, специально подобранный так, чтобы m делилось на p без остатка (каждый процесс получает ровно 2 строки). Цель </w:t>
+      </w:r>
+      <w:r>
+        <w:t xml:space="preserve">- </w:t>
+      </w:r>
+      <w:r>
+        <w:t>убедиться, что базовая логика чтения файлов, вычисления скалярных произведений и сбора результата работает правильно на данных, которые легко проверить вручную при необходимости.</w:t>
+      </w:r>
+    </w:p>
+    <w:p>
+      <w:r>
+        <w:t xml:space="preserve">Тест 2 (m=10, n=5, p=3) </w:t>
+      </w:r>
+      <w:r>
+        <w:t>-</w:t>
+      </w:r>
+      <w:r>
+        <w:t xml:space="preserve"> намеренно выбран так, чтобы m не делилось на p нацело (10 / 3 = 3 с остатком 1). Это важная проверка: она подтверждает, что формула распределения строк (</w:t>
+      </w:r>
+      <w:proofErr w:type="spellStart"/>
+      <w:r>
+        <w:t>base</w:t>
+      </w:r>
+      <w:proofErr w:type="spellEnd"/>
+      <w:r>
+        <w:t xml:space="preserve"> + </w:t>
+      </w:r>
+      <w:proofErr w:type="spellStart"/>
+      <w:r>
+        <w:t>rem</w:t>
+      </w:r>
+      <w:proofErr w:type="spellEnd"/>
+      <w:r>
+        <w:t xml:space="preserve">) действительно даёт разное число строк разным процессам (4/3/3), и что </w:t>
+      </w:r>
+      <w:proofErr w:type="spellStart"/>
+      <w:r>
+        <w:t>MPI_Gatherv</w:t>
+      </w:r>
+      <w:proofErr w:type="spellEnd"/>
+      <w:r>
+        <w:t xml:space="preserve"> — единственная функция, способная собрать результат при неодинаковых по размеру блоках, — работает корректно и </w:t>
+      </w:r>
+      <w:proofErr w:type="gramStart"/>
+      <w:r>
+        <w:t>не теряет</w:t>
+      </w:r>
+      <w:proofErr w:type="gramEnd"/>
+      <w:r>
+        <w:t xml:space="preserve"> и не путает местами данные.</w:t>
+      </w:r>
+    </w:p>
+    <w:p>
+      <w:r>
+        <w:t xml:space="preserve">Тест 3 (m=100, n=100, p=2) — проверка на граничном значении p, указанном в самой формулировке задания (2 ≤ p </w:t>
+      </w:r>
+      <w:r>
+        <w:rPr>
+          <w:rFonts w:ascii="Cambria Math" w:hAnsi="Cambria Math" w:cs="Cambria Math"/>
+        </w:rPr>
+        <w:t>≪</w:t>
+      </w:r>
+      <w:r>
         <w:t xml:space="preserve"> </w:t>
       </w:r>
-      <w:r>
-        <w:t xml:space="preserve">по сравнению с собственной реализацией на уровне </w:t>
-      </w:r>
-      <w:r>
-        <w:rPr>
-          <w:lang w:val="en-US"/>
-        </w:rPr>
-        <w:t>point</w:t>
-      </w:r>
+      <w:proofErr w:type="spellStart"/>
+      <w:proofErr w:type="gramStart"/>
+      <w:r>
+        <w:t>m,n</w:t>
+      </w:r>
+      <w:proofErr w:type="spellEnd"/>
+      <w:proofErr w:type="gramEnd"/>
+      <w:r>
+        <w:t>), то есть минимально допустимом числе процессов, а также первый тест на данных чуть большего размера, где случайность генерации проявляется заметнее, чем на матрице 6×4.</w:t>
+      </w:r>
+    </w:p>
+    <w:p>
+      <w:r>
+        <w:t xml:space="preserve">Тест 4 (m=n=5000, p=1,2,4,8) — основная серия замеров для анализа производительности (пункт 3 задания). Размер 5000×5000 выбран достаточно большим, чтобы время вычислений (десятки миллисекунд) значительно превышало погрешность измерения таймера </w:t>
+      </w:r>
+      <w:proofErr w:type="spellStart"/>
+      <w:r>
+        <w:t>MPI_Wtime</w:t>
+      </w:r>
+      <w:proofErr w:type="spellEnd"/>
+      <w:r>
+        <w:t xml:space="preserve"> и накладные расходы на запуск MPI, в </w:t>
+      </w:r>
+      <w:r>
+        <w:lastRenderedPageBreak/>
+        <w:t>отличие от лабораторной работы №10–11, где измеряемые времена были на грани разрешения таймера.</w:t>
+      </w:r>
+    </w:p>
+    <w:p>
+      <w:r>
+        <w:t xml:space="preserve">Во всех четырёх группах тестов отклонение от эталонного результата, вычисленного независимо в </w:t>
+      </w:r>
+      <w:proofErr w:type="spellStart"/>
+      <w:r>
+        <w:t>prepare_data.c</w:t>
+      </w:r>
+      <w:proofErr w:type="spellEnd"/>
+      <w:r>
+        <w:t>, держится в диапазоне 10⁻⁸–10⁻¹⁰, что соответствует стандартной погрешности округления при сохранении чисел двойной точности в текстовом виде с ограниченным числом знаков после запятой, а не является признаком ошибки в алгоритме.</w:t>
+      </w:r>
+    </w:p>
+    <w:p>
+      <w:pPr>
+        <w:rPr>
+          <w:b/>
+          <w:bCs/>
+        </w:rPr>
+      </w:pPr>
+    </w:p>
+    <w:p>
+      <w:r>
+        <w:t>Д</w:t>
+      </w:r>
+      <w:r>
+        <w:t xml:space="preserve">анные корректны и логически непротиворечивы: на всех тестах (6×4, 10×5, 100×100, 5000×5000) отклонение от эталонного результата держится в диапазоне 10⁻⁸–10⁻¹⁰, что является нормальной погрешностью округления при сохранении чисел двойной точности в текстовом виде с ограниченным числом знаков после запятой, а не признаком ошибки в алгоритме. Особенно важно, что тест на "неровном" делении (m=10, p=3, блоки по 4/3/3 строки) прошёл успешно </w:t>
+      </w:r>
+      <w:proofErr w:type="gramStart"/>
       <w:r>
         <w:t>-</w:t>
       </w:r>
       <w:r>
-        <w:rPr>
-          <w:lang w:val="en-US"/>
-        </w:rPr>
-        <w:t>to</w:t>
-      </w:r>
-      <w:r>
-        <w:t>-</w:t>
-      </w:r>
-      <w:r>
-        <w:rPr>
-          <w:lang w:val="en-US"/>
-        </w:rPr>
-        <w:t>point</w:t>
-      </w:r>
-      <w:r>
-        <w:t xml:space="preserve"> обменов.</w:t>
-      </w:r>
-    </w:p>
-    <w:p>
-      <w:pPr>
-        <w:rPr>
-          <w:lang w:val="en-US"/>
-        </w:rPr>
-      </w:pPr>
-      <w:r>
-        <w:t xml:space="preserve">Важный момент: мы сравниваем не всю программу целиком, а именно стоимость рассылки одного значения </w:t>
-      </w:r>
-      <w:r>
-        <w:rPr>
-          <w:lang w:val="en-US"/>
-        </w:rPr>
-        <w:t>n</w:t>
-      </w:r>
-      <w:r>
-        <w:t xml:space="preserve"> ко всем процессам. Поэтому основная работа здесь - это коммуникация</w:t>
-      </w:r>
-      <w:r>
-        <w:rPr>
-          <w:lang w:val="en-US"/>
-        </w:rPr>
-        <w:t>,</w:t>
-      </w:r>
-      <w:r>
-        <w:t xml:space="preserve"> а не вычисления. </w:t>
-      </w:r>
-    </w:p>
-    <w:p>
-      <w:r>
-        <w:t xml:space="preserve">Итоговый вывод программы на разных количествах процессов представлен в конце файла. </w:t>
+        <w:t xml:space="preserve"> это</w:t>
+      </w:r>
+      <w:proofErr w:type="gramEnd"/>
+      <w:r>
+        <w:t xml:space="preserve"> подтверждает, что </w:t>
+      </w:r>
+      <w:proofErr w:type="spellStart"/>
+      <w:r>
+        <w:t>MPI_Gatherv</w:t>
+      </w:r>
+      <w:proofErr w:type="spellEnd"/>
+      <w:r>
+        <w:t xml:space="preserve"> корректно собирает результат при неравномерном распределении нагрузки.</w:t>
+      </w:r>
+    </w:p>
+    <w:p>
+      <w:r>
+        <w:t>Возьмём</w:t>
+      </w:r>
+      <w:r>
+        <w:t xml:space="preserve"> серию замеров на m=n=5000 (единственная серия, где данные сняты последовательно для P=1,2,4,8 при фиксированном размере задачи).</w:t>
       </w:r>
     </w:p>
     <w:p>
@@ -1049,12 +1417,11 @@
         <w:tblLook w:val="04A0" w:firstRow="1" w:lastRow="0" w:firstColumn="1" w:lastColumn="0" w:noHBand="0" w:noVBand="1"/>
       </w:tblPr>
       <w:tblGrid>
-        <w:gridCol w:w="496"/>
-        <w:gridCol w:w="1661"/>
-        <w:gridCol w:w="1832"/>
-        <w:gridCol w:w="2713"/>
-        <w:gridCol w:w="1745"/>
-        <w:gridCol w:w="1745"/>
+        <w:gridCol w:w="388"/>
+        <w:gridCol w:w="2236"/>
+        <w:gridCol w:w="1754"/>
+        <w:gridCol w:w="2516"/>
+        <w:gridCol w:w="2375"/>
       </w:tblGrid>
       <w:tr>
         <w:tc>
@@ -1090,12 +1457,21 @@
                 <w:bCs/>
               </w:rPr>
             </w:pPr>
+            <w:proofErr w:type="spellStart"/>
             <w:r>
               <w:rPr>
                 <w:b/>
                 <w:bCs/>
               </w:rPr>
-              <w:t>T_p2p (сек)</w:t>
+              <w:t>T_compute</w:t>
+            </w:r>
+            <w:proofErr w:type="spellEnd"/>
+            <w:r>
+              <w:rPr>
+                <w:b/>
+                <w:bCs/>
+              </w:rPr>
+              <w:t xml:space="preserve"> (сек)</w:t>
             </w:r>
           </w:p>
         </w:tc>
@@ -1117,7 +1493,7 @@
                 <w:b/>
                 <w:bCs/>
               </w:rPr>
-              <w:t>T_bcast</w:t>
+              <w:t>T_total</w:t>
             </w:r>
             <w:proofErr w:type="spellEnd"/>
             <w:r>
@@ -1155,7 +1531,7 @@
                 <w:b/>
                 <w:bCs/>
               </w:rPr>
-              <w:t xml:space="preserve"> (P2P/</w:t>
+              <w:t xml:space="preserve"> S = T1/</w:t>
             </w:r>
             <w:proofErr w:type="spellStart"/>
             <w:r>
@@ -1163,37 +1539,9 @@
                 <w:b/>
                 <w:bCs/>
               </w:rPr>
-              <w:t>Bcast</w:t>
+              <w:t>Tp</w:t>
             </w:r>
             <w:proofErr w:type="spellEnd"/>
-            <w:r>
-              <w:rPr>
-                <w:b/>
-                <w:bCs/>
-              </w:rPr>
-              <w:t>)</w:t>
-            </w:r>
-          </w:p>
-        </w:tc>
-        <w:tc>
-          <w:tcPr>
-            <w:tcW w:w="0" w:type="auto"/>
-            <w:hideMark/>
-          </w:tcPr>
-          <w:p>
-            <w:pPr>
-              <w:rPr>
-                <w:b/>
-                <w:bCs/>
-              </w:rPr>
-            </w:pPr>
-            <w:r>
-              <w:rPr>
-                <w:b/>
-                <w:bCs/>
-              </w:rPr>
-              <w:t>E_p2p (%)</w:t>
-            </w:r>
           </w:p>
         </w:tc>
         <w:tc>
@@ -1214,7 +1562,7 @@
                 <w:b/>
                 <w:bCs/>
               </w:rPr>
-              <w:t>E_bcast</w:t>
+              <w:t>Efficiency</w:t>
             </w:r>
             <w:proofErr w:type="spellEnd"/>
             <w:r>
@@ -1222,7 +1570,7 @@
                 <w:b/>
                 <w:bCs/>
               </w:rPr>
-              <w:t xml:space="preserve"> (%)</w:t>
+              <w:t xml:space="preserve"> E = S/P</w:t>
             </w:r>
           </w:p>
         </w:tc>
@@ -1235,7 +1583,63 @@
           </w:tcPr>
           <w:p>
             <w:r>
-              <w:lastRenderedPageBreak/>
+              <w:t>1</w:t>
+            </w:r>
+          </w:p>
+        </w:tc>
+        <w:tc>
+          <w:tcPr>
+            <w:tcW w:w="0" w:type="auto"/>
+            <w:hideMark/>
+          </w:tcPr>
+          <w:p>
+            <w:r>
+              <w:t>0.052292</w:t>
+            </w:r>
+          </w:p>
+        </w:tc>
+        <w:tc>
+          <w:tcPr>
+            <w:tcW w:w="0" w:type="auto"/>
+            <w:hideMark/>
+          </w:tcPr>
+          <w:p>
+            <w:r>
+              <w:t>0.052332</w:t>
+            </w:r>
+          </w:p>
+        </w:tc>
+        <w:tc>
+          <w:tcPr>
+            <w:tcW w:w="0" w:type="auto"/>
+            <w:hideMark/>
+          </w:tcPr>
+          <w:p>
+            <w:r>
+              <w:t>— (база)</w:t>
+            </w:r>
+          </w:p>
+        </w:tc>
+        <w:tc>
+          <w:tcPr>
+            <w:tcW w:w="0" w:type="auto"/>
+            <w:hideMark/>
+          </w:tcPr>
+          <w:p>
+            <w:r>
+              <w:t>— (база)</w:t>
+            </w:r>
+          </w:p>
+        </w:tc>
+      </w:tr>
+      <w:tr>
+        <w:tc>
+          <w:tcPr>
+            <w:tcW w:w="0" w:type="auto"/>
+            <w:hideMark/>
+          </w:tcPr>
+          <w:p>
+            <w:r>
               <w:t>2</w:t>
             </w:r>
           </w:p>
@@ -1247,7 +1651,7 @@
           </w:tcPr>
           <w:p>
             <w:r>
-              <w:t>0.020433</w:t>
+              <w:t>0.025631</w:t>
             </w:r>
           </w:p>
         </w:tc>
@@ -1258,7 +1662,7 @@
           </w:tcPr>
           <w:p>
             <w:r>
-              <w:t>0.019395</w:t>
+              <w:t>0.025686</w:t>
             </w:r>
           </w:p>
         </w:tc>
@@ -1269,7 +1673,7 @@
           </w:tcPr>
           <w:p>
             <w:r>
-              <w:t>1.054</w:t>
+              <w:t>2.037</w:t>
             </w:r>
           </w:p>
         </w:tc>
@@ -1280,18 +1684,7 @@
           </w:tcPr>
           <w:p>
             <w:r>
-              <w:t>100.00 (база)</w:t>
-            </w:r>
-          </w:p>
-        </w:tc>
-        <w:tc>
-          <w:tcPr>
-            <w:tcW w:w="0" w:type="auto"/>
-            <w:hideMark/>
-          </w:tcPr>
-          <w:p>
-            <w:r>
-              <w:t>100.00 (база)</w:t>
+              <w:t>101.83%</w:t>
             </w:r>
           </w:p>
         </w:tc>
@@ -1315,7 +1708,7 @@
           </w:tcPr>
           <w:p>
             <w:r>
-              <w:t>0.039823</w:t>
+              <w:t>0.013282</w:t>
             </w:r>
           </w:p>
         </w:tc>
@@ -1326,7 +1719,7 @@
           </w:tcPr>
           <w:p>
             <w:r>
-              <w:t>0.029699</w:t>
+              <w:t>0.013515</w:t>
             </w:r>
           </w:p>
         </w:tc>
@@ -1337,7 +1730,7 @@
           </w:tcPr>
           <w:p>
             <w:r>
-              <w:t>1.341</w:t>
+              <w:t>3.871</w:t>
             </w:r>
           </w:p>
         </w:tc>
@@ -1348,18 +1741,7 @@
           </w:tcPr>
           <w:p>
             <w:r>
-              <w:t>25.65</w:t>
-            </w:r>
-          </w:p>
-        </w:tc>
-        <w:tc>
-          <w:tcPr>
-            <w:tcW w:w="0" w:type="auto"/>
-            <w:hideMark/>
-          </w:tcPr>
-          <w:p>
-            <w:r>
-              <w:t>32.65</w:t>
+              <w:t>96.77%</w:t>
             </w:r>
           </w:p>
         </w:tc>
@@ -1383,7 +1765,7 @@
           </w:tcPr>
           <w:p>
             <w:r>
-              <w:t>0.108210</w:t>
+              <w:t>0.010638</w:t>
             </w:r>
           </w:p>
         </w:tc>
@@ -1394,7 +1776,7 @@
           </w:tcPr>
           <w:p>
             <w:r>
-              <w:t>0.055306</w:t>
+              <w:t>0.010775</w:t>
             </w:r>
           </w:p>
         </w:tc>
@@ -1405,7 +1787,7 @@
           </w:tcPr>
           <w:p>
             <w:r>
-              <w:t>1.957</w:t>
+              <w:t>4.856</w:t>
             </w:r>
           </w:p>
         </w:tc>
@@ -1416,478 +1798,158 @@
           </w:tcPr>
           <w:p>
             <w:r>
-              <w:t>4.72</w:t>
-            </w:r>
-          </w:p>
-        </w:tc>
-        <w:tc>
-          <w:tcPr>
-            <w:tcW w:w="0" w:type="auto"/>
-            <w:hideMark/>
-          </w:tcPr>
-          <w:p>
-            <w:r>
-              <w:t>8.77</w:t>
-            </w:r>
-          </w:p>
-        </w:tc>
-      </w:tr>
-      <w:tr>
-        <w:tc>
-          <w:tcPr>
-            <w:tcW w:w="0" w:type="auto"/>
-            <w:hideMark/>
-          </w:tcPr>
-          <w:p>
-            <w:r>
-              <w:t>16</w:t>
-            </w:r>
-          </w:p>
-        </w:tc>
-        <w:tc>
-          <w:tcPr>
-            <w:tcW w:w="0" w:type="auto"/>
-            <w:hideMark/>
-          </w:tcPr>
-          <w:p>
-            <w:r>
-              <w:t>0.335365</w:t>
-            </w:r>
-          </w:p>
-        </w:tc>
-        <w:tc>
-          <w:tcPr>
-            <w:tcW w:w="0" w:type="auto"/>
-            <w:hideMark/>
-          </w:tcPr>
-          <w:p>
-            <w:r>
-              <w:t>0.124698</w:t>
-            </w:r>
-          </w:p>
-        </w:tc>
-        <w:tc>
-          <w:tcPr>
-            <w:tcW w:w="0" w:type="auto"/>
-            <w:hideMark/>
-          </w:tcPr>
-          <w:p>
-            <w:r>
-              <w:t>2.689</w:t>
-            </w:r>
-          </w:p>
-        </w:tc>
-        <w:tc>
-          <w:tcPr>
-            <w:tcW w:w="0" w:type="auto"/>
-            <w:hideMark/>
-          </w:tcPr>
-          <w:p>
-            <w:r>
-              <w:t>0.76</w:t>
-            </w:r>
-          </w:p>
-        </w:tc>
-        <w:tc>
-          <w:tcPr>
-            <w:tcW w:w="0" w:type="auto"/>
-            <w:hideMark/>
-          </w:tcPr>
-          <w:p>
-            <w:r>
-              <w:t>1.94</w:t>
-            </w:r>
-          </w:p>
-        </w:tc>
-      </w:tr>
-      <w:tr>
-        <w:tc>
-          <w:tcPr>
-            <w:tcW w:w="0" w:type="auto"/>
-            <w:hideMark/>
-          </w:tcPr>
-          <w:p>
-            <w:r>
-              <w:t>32</w:t>
-            </w:r>
-          </w:p>
-        </w:tc>
-        <w:tc>
-          <w:tcPr>
-            <w:tcW w:w="0" w:type="auto"/>
-            <w:hideMark/>
-          </w:tcPr>
-          <w:p>
-            <w:r>
-              <w:t>0.844303</w:t>
-            </w:r>
-          </w:p>
-        </w:tc>
-        <w:tc>
-          <w:tcPr>
-            <w:tcW w:w="0" w:type="auto"/>
-            <w:hideMark/>
-          </w:tcPr>
-          <w:p>
-            <w:r>
-              <w:t>0.312264</w:t>
-            </w:r>
-          </w:p>
-        </w:tc>
-        <w:tc>
-          <w:tcPr>
-            <w:tcW w:w="0" w:type="auto"/>
-            <w:hideMark/>
-          </w:tcPr>
-          <w:p>
-            <w:r>
-              <w:t>2.704</w:t>
-            </w:r>
-          </w:p>
-        </w:tc>
-        <w:tc>
-          <w:tcPr>
-            <w:tcW w:w="0" w:type="auto"/>
-            <w:hideMark/>
-          </w:tcPr>
-          <w:p>
-            <w:r>
-              <w:t>0.15</w:t>
-            </w:r>
-          </w:p>
-        </w:tc>
-        <w:tc>
-          <w:tcPr>
-            <w:tcW w:w="0" w:type="auto"/>
-            <w:hideMark/>
-          </w:tcPr>
-          <w:p>
-            <w:r>
-              <w:t>0.39</w:t>
-            </w:r>
-          </w:p>
-        </w:tc>
-      </w:tr>
-      <w:tr>
-        <w:tc>
-          <w:tcPr>
-            <w:tcW w:w="0" w:type="auto"/>
-            <w:hideMark/>
-          </w:tcPr>
-          <w:p>
-            <w:r>
-              <w:t>64</w:t>
-            </w:r>
-          </w:p>
-        </w:tc>
-        <w:tc>
-          <w:tcPr>
-            <w:tcW w:w="0" w:type="auto"/>
-            <w:hideMark/>
-          </w:tcPr>
-          <w:p>
-            <w:r>
-              <w:t>1.837642</w:t>
-            </w:r>
-          </w:p>
-        </w:tc>
-        <w:tc>
-          <w:tcPr>
-            <w:tcW w:w="0" w:type="auto"/>
-            <w:hideMark/>
-          </w:tcPr>
-          <w:p>
-            <w:r>
-              <w:t>2.170725</w:t>
-            </w:r>
-          </w:p>
-        </w:tc>
-        <w:tc>
-          <w:tcPr>
-            <w:tcW w:w="0" w:type="auto"/>
-            <w:hideMark/>
-          </w:tcPr>
-          <w:p>
-            <w:r>
-              <w:t>0.847</w:t>
-            </w:r>
-          </w:p>
-        </w:tc>
-        <w:tc>
-          <w:tcPr>
-            <w:tcW w:w="0" w:type="auto"/>
-            <w:hideMark/>
-          </w:tcPr>
-          <w:p>
-            <w:r>
-              <w:t>0.03</w:t>
-            </w:r>
-          </w:p>
-        </w:tc>
-        <w:tc>
-          <w:tcPr>
-            <w:tcW w:w="0" w:type="auto"/>
-            <w:hideMark/>
-          </w:tcPr>
-          <w:p>
-            <w:r>
-              <w:t>0.03</w:t>
+              <w:t>60.70%</w:t>
             </w:r>
           </w:p>
         </w:tc>
       </w:tr>
     </w:tbl>
+    <w:p/>
     <w:p>
       <w:r>
         <w:t>Где:</w:t>
       </w:r>
     </w:p>
     <w:p>
-      <w:r>
-        <w:t>T_p2p</w:t>
-      </w:r>
-      <w:r>
-        <w:t xml:space="preserve"> </w:t>
-      </w:r>
-      <w:r>
-        <w:t>–</w:t>
-      </w:r>
-      <w:r>
-        <w:t xml:space="preserve"> в</w:t>
-      </w:r>
-      <w:r>
-        <w:t>ремя выполнения собственной реализации рассылки через двухточечные обмены</w:t>
-      </w:r>
-    </w:p>
-    <w:p>
+      <w:pPr>
+        <w:numPr>
+          <w:ilvl w:val="0"/>
+          <w:numId w:val="7"/>
+        </w:numPr>
+      </w:pPr>
       <w:proofErr w:type="spellStart"/>
       <w:r>
-        <w:t>T_bcast</w:t>
+        <w:rPr>
+          <w:b/>
+          <w:bCs/>
+        </w:rPr>
+        <w:lastRenderedPageBreak/>
+        <w:t>T_compute</w:t>
       </w:r>
       <w:proofErr w:type="spellEnd"/>
       <w:r>
-        <w:t xml:space="preserve"> </w:t>
-      </w:r>
-      <w:r>
-        <w:t>–</w:t>
-      </w:r>
-      <w:r>
-        <w:t xml:space="preserve"> </w:t>
-      </w:r>
-      <w:r>
-        <w:t>времен</w:t>
-      </w:r>
-      <w:r>
-        <w:t>я</w:t>
-      </w:r>
-      <w:r>
-        <w:t xml:space="preserve"> выполнения библиотечной коллективной функции</w:t>
-      </w:r>
-    </w:p>
-    <w:p>
-      <w:r>
-        <w:rPr>
-          <w:lang w:val="en-US"/>
-        </w:rPr>
-        <w:t>Speedup (P2P/</w:t>
+        <w:t xml:space="preserve"> — время, затраченное каждым процессом непосредственно на вычисление скалярных произведений своих строк (замеряется между </w:t>
       </w:r>
       <w:proofErr w:type="spellStart"/>
       <w:r>
-        <w:rPr>
-          <w:lang w:val="en-US"/>
-        </w:rPr>
-        <w:t>Bcast</w:t>
+        <w:t>MPI_Barrier</w:t>
       </w:r>
       <w:proofErr w:type="spellEnd"/>
       <w:r>
-        <w:rPr>
-          <w:lang w:val="en-US"/>
-        </w:rPr>
-        <w:t>)</w:t>
-      </w:r>
-      <w:r>
-        <w:rPr>
-          <w:lang w:val="en-US"/>
-        </w:rPr>
-        <w:t xml:space="preserve"> – </w:t>
-      </w:r>
-      <w:r>
-        <w:t>отношение</w:t>
-      </w:r>
-      <w:r>
-        <w:rPr>
-          <w:lang w:val="en-US"/>
-        </w:rPr>
-        <w:t xml:space="preserve"> </w:t>
-      </w:r>
-      <w:r>
-        <w:t>между</w:t>
-      </w:r>
-      <w:r>
-        <w:rPr>
-          <w:lang w:val="en-US"/>
-        </w:rPr>
-        <w:t xml:space="preserve"> </w:t>
-      </w:r>
-      <w:r>
-        <w:rPr>
-          <w:lang w:val="en-US"/>
-        </w:rPr>
-        <w:t>T_p2p</w:t>
-      </w:r>
-      <w:r>
-        <w:rPr>
-          <w:lang w:val="en-US"/>
-        </w:rPr>
-        <w:t xml:space="preserve"> </w:t>
-      </w:r>
-      <w:r>
-        <w:t>и</w:t>
-      </w:r>
-      <w:r>
-        <w:rPr>
-          <w:lang w:val="en-US"/>
-        </w:rPr>
-        <w:t xml:space="preserve"> </w:t>
-      </w:r>
+        <w:t xml:space="preserve"> и завершением локального цикла умножения), взятое как максимальное среди всех процессов;</w:t>
+      </w:r>
+    </w:p>
+    <w:p>
+      <w:pPr>
+        <w:numPr>
+          <w:ilvl w:val="0"/>
+          <w:numId w:val="7"/>
+        </w:numPr>
+      </w:pPr>
       <w:proofErr w:type="spellStart"/>
       <w:r>
         <w:rPr>
-          <w:lang w:val="en-US"/>
-        </w:rPr>
-        <w:t>T_bcast</w:t>
+          <w:b/>
+          <w:bCs/>
+        </w:rPr>
+        <w:t>T_total</w:t>
       </w:r>
       <w:proofErr w:type="spellEnd"/>
       <w:r>
-        <w:rPr>
-          <w:lang w:val="en-US"/>
-        </w:rPr>
-        <w:t xml:space="preserve">. </w:t>
-      </w:r>
-      <w:r>
-        <w:t xml:space="preserve">Если </w:t>
+        <w:t xml:space="preserve"> — время вычислений плюс время сбора результата через </w:t>
       </w:r>
       <w:proofErr w:type="spellStart"/>
       <w:r>
-        <w:t>speedup</w:t>
+        <w:t>MPI_Gatherv</w:t>
       </w:r>
       <w:proofErr w:type="spellEnd"/>
       <w:r>
-        <w:t xml:space="preserve"> &gt; 1, то собственная реализация медленнее </w:t>
+        <w:t xml:space="preserve"> на процессе 0; именно эта величина используется как </w:t>
       </w:r>
       <w:proofErr w:type="spellStart"/>
       <w:r>
-        <w:t>MPI_Bcast</w:t>
+        <w:t>Tp</w:t>
       </w:r>
       <w:proofErr w:type="spellEnd"/>
       <w:r>
-        <w:t xml:space="preserve">. </w:t>
-      </w:r>
-      <w:r>
-        <w:t>Е</w:t>
-      </w:r>
-      <w:r>
-        <w:t xml:space="preserve">сли </w:t>
-      </w:r>
+        <w:t xml:space="preserve"> в расчёте ускорения, так как она отражает полное время параллельного этапа программы, включая коммуникацию;</w:t>
+      </w:r>
+    </w:p>
+    <w:p>
+      <w:pPr>
+        <w:numPr>
+          <w:ilvl w:val="0"/>
+          <w:numId w:val="7"/>
+        </w:numPr>
+      </w:pPr>
       <w:proofErr w:type="spellStart"/>
       <w:r>
-        <w:t>speedup</w:t>
+        <w:rPr>
+          <w:b/>
+          <w:bCs/>
+        </w:rPr>
+        <w:t>Speedup</w:t>
       </w:r>
       <w:proofErr w:type="spellEnd"/>
       <w:r>
-        <w:t xml:space="preserve"> &lt; 1, то собственная реализация оказалась быстрее</w:t>
-      </w:r>
-    </w:p>
-    <w:p>
-      <w:r>
-        <w:t xml:space="preserve">E_p2p (%) </w:t>
-      </w:r>
-      <w:r>
-        <w:t>–</w:t>
-      </w:r>
-      <w:r>
-        <w:t xml:space="preserve"> эффективность реализации через двухточечные обмены относительно базовой точки P=2, вычисленная по формуле E_p2p = S_p2p / (P/2), где S_p2p = T_p2p(P=2) / T_p2p(P). Показывает, насколько сильно замедляется собственная реализация при увеличении числа процессов относительно её же поведения при P=2. Чем ближе значение к 100%, тем лучше реализация масштабируется; падение к нулю означает, что рост числа процессов почти полностью компенсируется ростом затрат на коммуникацию.</w:t>
-      </w:r>
-    </w:p>
-    <w:p>
+        <w:rPr>
+          <w:b/>
+          <w:bCs/>
+        </w:rPr>
+        <w:t xml:space="preserve"> S = T1/</w:t>
+      </w:r>
       <w:proofErr w:type="spellStart"/>
       <w:r>
-        <w:t>E_bcast</w:t>
+        <w:rPr>
+          <w:b/>
+          <w:bCs/>
+        </w:rPr>
+        <w:t>Tp</w:t>
       </w:r>
       <w:proofErr w:type="spellEnd"/>
       <w:r>
-        <w:t xml:space="preserve"> (%) </w:t>
-      </w:r>
-      <w:r>
-        <w:t>–</w:t>
-      </w:r>
-      <w:r>
-        <w:t xml:space="preserve"> эффективность коллективной функции </w:t>
-      </w:r>
+        <w:t xml:space="preserve"> — отношение времени последовательного выполнения (P=1) к времени выполнения при P процессах. Показывает, во сколько раз параллельная версия быстрее последовательной. Значение S = P соответствует идеальному (линейному) ускорению;</w:t>
+      </w:r>
+    </w:p>
+    <w:p>
+      <w:pPr>
+        <w:numPr>
+          <w:ilvl w:val="0"/>
+          <w:numId w:val="7"/>
+        </w:numPr>
+      </w:pPr>
       <w:proofErr w:type="spellStart"/>
       <w:r>
-        <w:t>MPI_Bcast</w:t>
+        <w:rPr>
+          <w:b/>
+          <w:bCs/>
+        </w:rPr>
+        <w:t>Efficiency</w:t>
       </w:r>
       <w:proofErr w:type="spellEnd"/>
       <w:r>
-        <w:t xml:space="preserve"> относительно той же базовой точки P=2, вычисленная аналогично: </w:t>
+        <w:rPr>
+          <w:b/>
+          <w:bCs/>
+        </w:rPr>
+        <w:t xml:space="preserve"> E = S/P</w:t>
+      </w:r>
+      <w:r>
+        <w:t xml:space="preserve"> — доля идеального ускорения, реально достигнутая программой. Значение, близкое к 100%, означает, что почти вся вычислительная мощность добавленных процессов используется по назначению; значение, заметно меньшее 100%, указывает на потери из-за накладных расходов или ограничений аппаратуры; значение, превышающее 100%, указывает на эффект </w:t>
       </w:r>
       <w:proofErr w:type="spellStart"/>
       <w:r>
-        <w:t>E_bcast</w:t>
+        <w:t>сверхлинейного</w:t>
       </w:r>
       <w:proofErr w:type="spellEnd"/>
       <w:r>
-        <w:t xml:space="preserve"> = </w:t>
-      </w:r>
-      <w:proofErr w:type="spellStart"/>
-      <w:r>
-        <w:t>S_bcast</w:t>
-      </w:r>
-      <w:proofErr w:type="spellEnd"/>
-      <w:r>
-        <w:t xml:space="preserve"> / (P/2), где </w:t>
-      </w:r>
-      <w:proofErr w:type="spellStart"/>
-      <w:r>
-        <w:t>S_bcast</w:t>
-      </w:r>
-      <w:proofErr w:type="spellEnd"/>
-      <w:r>
-        <w:t xml:space="preserve"> = </w:t>
-      </w:r>
-      <w:proofErr w:type="spellStart"/>
-      <w:r>
-        <w:t>T_bcast</w:t>
-      </w:r>
-      <w:proofErr w:type="spellEnd"/>
-      <w:r>
-        <w:t xml:space="preserve">(P=2) / </w:t>
-      </w:r>
-      <w:proofErr w:type="spellStart"/>
-      <w:r>
-        <w:t>T_bcast</w:t>
-      </w:r>
-      <w:proofErr w:type="spellEnd"/>
-      <w:r>
-        <w:t xml:space="preserve">(P). Позволяет сравнить, насколько лучше или хуже </w:t>
-      </w:r>
-      <w:proofErr w:type="spellStart"/>
-      <w:r>
-        <w:t>MPI_Bcast</w:t>
-      </w:r>
-      <w:proofErr w:type="spellEnd"/>
-      <w:r>
-        <w:t xml:space="preserve"> масштабируется по сравнению с собственной реализацией — при одинаковом P более высокое значение </w:t>
-      </w:r>
-      <w:proofErr w:type="spellStart"/>
-      <w:r>
-        <w:t>E_bcast</w:t>
-      </w:r>
-      <w:proofErr w:type="spellEnd"/>
-      <w:r>
-        <w:t xml:space="preserve"> относительно E_p2p означает, что коллективная операция теряет меньше эффективности при росте числа процессов.</w:t>
-      </w:r>
+        <w:t xml:space="preserve"> ускорения (объяснён ниже).</w:t>
+      </w:r>
+    </w:p>
+    <w:p>
+      <w:pPr>
+        <w:jc w:val="center"/>
+      </w:pPr>
     </w:p>
     <w:p>
       <w:pPr>
@@ -1899,33 +1961,10 @@
         </w:rPr>
         <w:lastRenderedPageBreak/>
         <w:drawing>
-          <wp:inline distT="0" distB="0" distL="0" distR="0" wp14:anchorId="2F74E9EF" wp14:editId="1A67EE2A">
+          <wp:inline distT="0" distB="0" distL="0" distR="0" wp14:anchorId="5BCB29E7" wp14:editId="360F0F94">
             <wp:extent cx="5486400" cy="3200400"/>
             <wp:effectExtent l="0" t="0" r="0" b="0"/>
-            <wp:docPr id="1196021034" name="Диаграмма 1"/>
-            <wp:cNvGraphicFramePr/>
-            <a:graphic xmlns:a="http://schemas.openxmlformats.org/drawingml/2006/main">
-              <a:graphicData uri="http://schemas.openxmlformats.org/drawingml/2006/chart">
-                <c:chart xmlns:c="http://schemas.openxmlformats.org/drawingml/2006/chart" xmlns:r="http://schemas.openxmlformats.org/officeDocument/2006/relationships" r:id="rId9"/>
-              </a:graphicData>
-            </a:graphic>
-          </wp:inline>
-        </w:drawing>
-      </w:r>
-    </w:p>
-    <w:p>
-      <w:pPr>
-        <w:jc w:val="center"/>
-      </w:pPr>
-      <w:r>
-        <w:rPr>
-          <w:noProof/>
-        </w:rPr>
-        <w:drawing>
-          <wp:inline distT="0" distB="0" distL="0" distR="0" wp14:anchorId="3F0B6487" wp14:editId="1BA3F113">
-            <wp:extent cx="5486400" cy="3200400"/>
-            <wp:effectExtent l="0" t="0" r="0" b="0"/>
-            <wp:docPr id="207024133" name="Диаграмма 1"/>
+            <wp:docPr id="299465260" name="Диаграмма 1"/>
             <wp:cNvGraphicFramePr/>
             <a:graphic xmlns:a="http://schemas.openxmlformats.org/drawingml/2006/main">
               <a:graphicData uri="http://schemas.openxmlformats.org/drawingml/2006/chart">
@@ -1936,143 +1975,77 @@
         </w:drawing>
       </w:r>
     </w:p>
-    <w:p/>
-    <w:p/>
-    <w:p>
-      <w:pPr>
-        <w:ind w:firstLine="708"/>
-      </w:pPr>
-      <w:r>
-        <w:t>Полученные результаты демонстрируют закономерность, полностью соответствующую теоретическим ожиданиям, сформулированным при планировании эксперимента. Время выполнения собственной реализации рассылки через двухточечные обмены (T_p2p) растёт значительно быстрее времени выполнения библиотечной коллективной функции (</w:t>
+    <w:p>
+      <w:pPr>
+        <w:jc w:val="center"/>
+        <w:rPr>
+          <w:lang w:val="en-US"/>
+        </w:rPr>
+      </w:pPr>
+      <w:r>
+        <w:rPr>
+          <w:noProof/>
+        </w:rPr>
+        <w:drawing>
+          <wp:inline distT="0" distB="0" distL="0" distR="0" wp14:anchorId="622603F8" wp14:editId="2E61E40F">
+            <wp:extent cx="5486400" cy="3200400"/>
+            <wp:effectExtent l="0" t="0" r="0" b="0"/>
+            <wp:docPr id="1930595276" name="Диаграмма 1"/>
+            <wp:cNvGraphicFramePr/>
+            <a:graphic xmlns:a="http://schemas.openxmlformats.org/drawingml/2006/main">
+              <a:graphicData uri="http://schemas.openxmlformats.org/drawingml/2006/chart">
+                <c:chart xmlns:c="http://schemas.openxmlformats.org/drawingml/2006/chart" xmlns:r="http://schemas.openxmlformats.org/officeDocument/2006/relationships" r:id="rId11"/>
+              </a:graphicData>
+            </a:graphic>
+          </wp:inline>
+        </w:drawing>
+      </w:r>
+    </w:p>
+    <w:p>
+      <w:r>
+        <w:t>В отличие от предыдущей лабораторной работы, посвящённой сравнению коллективных и двухточечных операций, данная задача относится к классической модели сильного масштабирования (</w:t>
       </w:r>
       <w:proofErr w:type="spellStart"/>
       <w:r>
-        <w:t>T_bcast</w:t>
+        <w:t>strong</w:t>
       </w:r>
       <w:proofErr w:type="spellEnd"/>
       <w:r>
-        <w:t xml:space="preserve">) на всём диапазоне от P=2 до P=32: при увеличении числа процессов в шестнадцать раз (с 2 до 32) время T_p2p возросло </w:t>
-      </w:r>
+        <w:t xml:space="preserve"> </w:t>
+      </w:r>
+      <w:proofErr w:type="spellStart"/>
+      <w:r>
+        <w:t>scaling</w:t>
+      </w:r>
+      <w:proofErr w:type="spellEnd"/>
+      <w:r>
+        <w:t>): общий объём вычислительной нагрузки (умножение фиксированной матрицы 5000×5000 на вектор) остаётся неизменным при любом числе процессов, а изменяется лишь степень его разделения между процессами. Именно поэтому здесь применение классических формул S = T1/</w:t>
+      </w:r>
+      <w:proofErr w:type="spellStart"/>
+      <w:r>
+        <w:t>Tp</w:t>
+      </w:r>
+      <w:proofErr w:type="spellEnd"/>
+      <w:r>
+        <w:t xml:space="preserve"> и E = S/P в их исходном, не адаптированном виде является полностью корректным и методически обоснованным </w:t>
+      </w:r>
+      <w:r>
+        <w:t>-</w:t>
+      </w:r>
+      <w:r>
+        <w:t xml:space="preserve"> в отличие от задачи рассылки значения, где объём коммуникационной нагрузки рос вместе с числом процессов.</w:t>
+      </w:r>
+    </w:p>
+    <w:p>
       <w:r>
         <w:lastRenderedPageBreak/>
-        <w:t xml:space="preserve">примерно в 41 раз, тогда как </w:t>
-      </w:r>
-      <w:proofErr w:type="spellStart"/>
-      <w:r>
-        <w:t>T_bcast</w:t>
-      </w:r>
-      <w:proofErr w:type="spellEnd"/>
-      <w:r>
-        <w:t xml:space="preserve"> — примерно в 16 раз. Эта разница напрямую объясняется различием в алгоритмической сложности двух подходов. Реализация </w:t>
-      </w:r>
-      <w:proofErr w:type="spellStart"/>
-      <w:r>
-        <w:t>broadcast_point_to_point</w:t>
-      </w:r>
-      <w:proofErr w:type="spellEnd"/>
-      <w:r>
-        <w:t xml:space="preserve"> выполняет корневым процессом последовательность из P−1 вызовов </w:t>
-      </w:r>
-      <w:proofErr w:type="spellStart"/>
-      <w:r>
-        <w:t>MPI_Send</w:t>
-      </w:r>
-      <w:proofErr w:type="spellEnd"/>
-      <w:r>
-        <w:t xml:space="preserve">, из-за чего общее время рассылки растёт линейно относительно числа процессов, то есть имеет сложность порядка O(P). Библиотечная функция </w:t>
-      </w:r>
-      <w:proofErr w:type="spellStart"/>
-      <w:r>
-        <w:t>MPI_Bcast</w:t>
-      </w:r>
-      <w:proofErr w:type="spellEnd"/>
-      <w:r>
-        <w:t>, напротив, реализована с использованием внутреннего алгоритма распространения данных по логарифмической схеме (как правило, по принципу биномиального дерева), при которой на каждом шаге число процессов, уже получивших значение, удваивается, что обеспечивает сложность порядка O(</w:t>
-      </w:r>
-      <w:proofErr w:type="spellStart"/>
-      <w:r>
-        <w:t>log</w:t>
-      </w:r>
-      <w:proofErr w:type="spellEnd"/>
-      <w:r>
-        <w:t xml:space="preserve"> P). Именно поэтому относительное ускорение </w:t>
-      </w:r>
-      <w:proofErr w:type="spellStart"/>
-      <w:r>
-        <w:t>Speedup</w:t>
-      </w:r>
-      <w:proofErr w:type="spellEnd"/>
-      <w:r>
-        <w:t xml:space="preserve"> (P2P/</w:t>
-      </w:r>
-      <w:proofErr w:type="spellStart"/>
-      <w:r>
-        <w:t>Bcast</w:t>
-      </w:r>
-      <w:proofErr w:type="spellEnd"/>
-      <w:r>
-        <w:t>) стабильно растёт с увеличением P — с 1.054 при P=2 до 2.704 при P=32, — наглядно показывая, что разрыв в производительности между линейным и логарифмическим алгоритмами увеличивается пропорционально масштабу задачи, а не остаётся постоянным.</w:t>
-      </w:r>
-    </w:p>
-    <w:p>
-      <w:r>
-        <w:t xml:space="preserve">Показатели эффективности E_p2p и </w:t>
-      </w:r>
-      <w:proofErr w:type="spellStart"/>
-      <w:r>
-        <w:t>E_bcast</w:t>
-      </w:r>
-      <w:proofErr w:type="spellEnd"/>
-      <w:r>
-        <w:t xml:space="preserve">, вычисленные относительно базовой точки P=2, закономерно убывают для обеих реализаций по мере роста числа процессов, что является ожидаемым следствием характера задачи: в отличие от классической модели сильного масштабирования, где объём вычислительной работы фиксирован и делится между процессами, в задаче рассылки значения объём коммуникационной нагрузки сам растёт вместе с числом процессов-получателей. Тем не менее падение эффективности </w:t>
-      </w:r>
-      <w:proofErr w:type="spellStart"/>
-      <w:r>
-        <w:t>point</w:t>
-      </w:r>
-      <w:proofErr w:type="spellEnd"/>
+        <w:t xml:space="preserve">Результаты демонстрируют близкое к идеальному масштабирование в диапазоне от P=1 до P=4: эффективность составляет 101.83% при P=2 и 96.77% при P=4, что подтверждает корректность выбранной стратегии распределения нагрузки </w:t>
+      </w:r>
       <w:r>
         <w:t>-</w:t>
       </w:r>
-      <w:proofErr w:type="spellStart"/>
-      <w:r>
-        <w:t>to</w:t>
-      </w:r>
-      <w:proofErr w:type="spellEnd"/>
-      <w:r>
-        <w:t>-</w:t>
-      </w:r>
-      <w:proofErr w:type="spellStart"/>
-      <w:r>
-        <w:t>point</w:t>
-      </w:r>
-      <w:proofErr w:type="spellEnd"/>
-      <w:r>
-        <w:t xml:space="preserve">-реализации происходит существенно быстрее, чем у </w:t>
-      </w:r>
-      <w:proofErr w:type="spellStart"/>
-      <w:r>
-        <w:t>MPI_Bcast</w:t>
-      </w:r>
-      <w:proofErr w:type="spellEnd"/>
-      <w:r>
-        <w:t xml:space="preserve">: при P=8 эффективность собственной реализации составляет лишь 4.72% против 8.77% у </w:t>
-      </w:r>
-      <w:proofErr w:type="spellStart"/>
-      <w:r>
-        <w:t>MPI_Bcast</w:t>
-      </w:r>
-      <w:proofErr w:type="spellEnd"/>
-      <w:r>
-        <w:t xml:space="preserve">, а при P=32 — 0.15% против 0.39% соответственно. Эффективность обеих реализаций в абсолютном выражении оказывается близка к нулю уже при относительно небольшом числе процессов, что связано с крайне малым объёмом полезной нагрузки операции (передаётся единственное значение типа </w:t>
-      </w:r>
-      <w:proofErr w:type="spellStart"/>
-      <w:r>
-        <w:t>int</w:t>
-      </w:r>
-      <w:proofErr w:type="spellEnd"/>
-      <w:r>
-        <w:t>) — в такой конфигурации любое увеличение числа процессов почти целиком уходит на организацию обмена, а не на содержательную работу, поэтому классическая интерпретация эффективности как меры "полезного использования процессоров" здесь применима с оговоркой на слабое масштабирование задачи, как было отмечено ранее.</w:t>
+      <w:r>
+        <w:t xml:space="preserve"> блочное разбиение матрицы по строкам обеспечивает практически равномерную и полностью независимую загрузку процессов, так как вычисление каждой строки требует одинакового объёма арифметических операций (n умножений и n−1 сложений) и не зависит от результатов, полученных другими процессами.</w:t>
       </w:r>
     </w:p>
     <w:p>
@@ -2087,97 +2060,159 @@
           <w:b/>
           <w:bCs/>
         </w:rPr>
+        <w:t xml:space="preserve">Явление </w:t>
+      </w:r>
+      <w:proofErr w:type="spellStart"/>
+      <w:r>
+        <w:rPr>
+          <w:b/>
+          <w:bCs/>
+        </w:rPr>
+        <w:t>сверхлинейного</w:t>
+      </w:r>
+      <w:proofErr w:type="spellEnd"/>
+      <w:r>
+        <w:rPr>
+          <w:b/>
+          <w:bCs/>
+        </w:rPr>
+        <w:t xml:space="preserve"> ускорения при P=2</w:t>
+      </w:r>
+    </w:p>
+    <w:p>
+      <w:r>
+        <w:t>Отдельного объяснения заслуживает значение эффективности, превышающее 100% при P=2 (</w:t>
+      </w:r>
+      <w:proofErr w:type="spellStart"/>
+      <w:r>
+        <w:t>Speedup</w:t>
+      </w:r>
+      <w:proofErr w:type="spellEnd"/>
+      <w:r>
+        <w:t xml:space="preserve"> = 2.037 вместо теоретически максимального 2.0). Такой эффект, называемый </w:t>
+      </w:r>
+      <w:proofErr w:type="spellStart"/>
+      <w:r>
+        <w:t>сверхлинейным</w:t>
+      </w:r>
+      <w:proofErr w:type="spellEnd"/>
+      <w:r>
+        <w:t xml:space="preserve"> ускорением (</w:t>
+      </w:r>
+      <w:proofErr w:type="spellStart"/>
+      <w:r>
+        <w:t>superlinear</w:t>
+      </w:r>
+      <w:proofErr w:type="spellEnd"/>
+      <w:r>
+        <w:t xml:space="preserve"> </w:t>
+      </w:r>
+      <w:proofErr w:type="spellStart"/>
+      <w:r>
+        <w:t>speedup</w:t>
+      </w:r>
+      <w:proofErr w:type="spellEnd"/>
+      <w:r>
+        <w:t xml:space="preserve">), на первый взгляд противоречит теории, однако имеет объективное техническое объяснение и часто наблюдается на практике при разделении больших массивов данных между процессами. При работе с полной матрицей 5000×5000 (что соответствует примерно 200 мегабайтам памяти в формате </w:t>
+      </w:r>
+      <w:proofErr w:type="spellStart"/>
+      <w:r>
+        <w:t>double</w:t>
+      </w:r>
+      <w:proofErr w:type="spellEnd"/>
+      <w:r>
+        <w:t>) на одном процессе вся структура данных не помещается целиком в кэш-память процессора, что приводит к частым обращениям к оперативной памяти и связанным с этим задержкам. При разделении матрицы на два блока по 2500 строк каждый процесс работает с вдвое меньшим объёмом данных, что повышает вероятность более эффективного использования кэша каждого процессорного ядра и, как следствие, даёт прирост производительности, превышающий чисто арифметическое разделение нагрузки на количество процессов.</w:t>
+      </w:r>
+    </w:p>
+    <w:p>
+      <w:pPr>
+        <w:rPr>
+          <w:b/>
+          <w:bCs/>
+        </w:rPr>
+      </w:pPr>
+      <w:r>
+        <w:rPr>
+          <w:b/>
+          <w:bCs/>
+        </w:rPr>
+        <w:t>Снижение эффективности при P=8</w:t>
+      </w:r>
+    </w:p>
+    <w:p>
+      <w:r>
+        <w:t xml:space="preserve">При увеличении числа процессов до восьми эффективность резко падает до 60.70%, что уже не может быть объяснено накладными расходами на передачу данных — судя по столбцу </w:t>
+      </w:r>
+      <w:proofErr w:type="spellStart"/>
+      <w:r>
+        <w:t>T_total</w:t>
+      </w:r>
+      <w:proofErr w:type="spellEnd"/>
+      <w:r>
+        <w:t xml:space="preserve">, доля времени, затрачиваемого на сбор результата через </w:t>
+      </w:r>
+      <w:proofErr w:type="spellStart"/>
+      <w:r>
+        <w:t>MPI_Gatherv</w:t>
+      </w:r>
+      <w:proofErr w:type="spellEnd"/>
+      <w:r>
+        <w:t xml:space="preserve"> (разница между </w:t>
+      </w:r>
+      <w:proofErr w:type="spellStart"/>
+      <w:r>
+        <w:t>T_total</w:t>
+      </w:r>
+      <w:proofErr w:type="spellEnd"/>
+      <w:r>
+        <w:t xml:space="preserve"> и </w:t>
+      </w:r>
+      <w:proofErr w:type="spellStart"/>
+      <w:r>
+        <w:t>T_compute</w:t>
+      </w:r>
+      <w:proofErr w:type="spellEnd"/>
+      <w:r>
+        <w:t xml:space="preserve">), остаётся исчезающе малой (0.000137 сек, менее 1.3% от общего времени) и не является причиной наблюдаемого падения эффективности. Наиболее вероятной причиной является ограничение числа физически доступных вычислительных ядер на используемой машине: если фактическое число ядер процессора меньше восьми, операционная система вынуждена </w:t>
+      </w:r>
+      <w:r>
         <w:lastRenderedPageBreak/>
-        <w:t>Объяснение аномалии при P=64</w:t>
-      </w:r>
-    </w:p>
-    <w:p>
-      <w:r>
-        <w:t xml:space="preserve">Отдельного внимания заслуживает результат при P=64, где наблюдается качественная смена картины: время </w:t>
+        <w:t>распределять MPI-процессы с переподпиской (</w:t>
       </w:r>
       <w:proofErr w:type="spellStart"/>
       <w:r>
-        <w:t>MPI_Bcast</w:t>
+        <w:t>oversubscription</w:t>
       </w:r>
       <w:proofErr w:type="spellEnd"/>
       <w:r>
-        <w:t xml:space="preserve"> (2.171 сек) впервые превышает время </w:t>
-      </w:r>
-      <w:proofErr w:type="spellStart"/>
-      <w:r>
-        <w:t>point-to-point</w:t>
-      </w:r>
-      <w:proofErr w:type="spellEnd"/>
-      <w:r>
-        <w:t xml:space="preserve"> (1.838 сек), а относительное ускорение падает ниже единицы (0.847), то есть коллективная операция становится медленнее собственной реализации. Это не свидетельствует об ошибке в измерениях или в коде, а является закономерным проявлением эффекта переподписки вычислительных ресурсов (</w:t>
-      </w:r>
-      <w:proofErr w:type="spellStart"/>
-      <w:r>
-        <w:t>oversubscription</w:t>
-      </w:r>
-      <w:proofErr w:type="spellEnd"/>
-      <w:r>
-        <w:t>). Число физических процессорных ядер на типичной рабочей станции существенно меньше 64, поэтому при запуске такого количества MPI-процессов операционная система вынуждена распределять их между ограниченным числом ядер с постоянным переключением контекста, что вносит значительный и неравномерный по времени системный шум (</w:t>
-      </w:r>
-      <w:proofErr w:type="spellStart"/>
-      <w:r>
-        <w:t>jitter</w:t>
-      </w:r>
-      <w:proofErr w:type="spellEnd"/>
-      <w:r>
-        <w:t>) в работу каждого процесса.</w:t>
-      </w:r>
-    </w:p>
-    <w:p>
-      <w:r>
-        <w:t xml:space="preserve">Данный эффект особым образом сказывается именно на коллективной операции </w:t>
-      </w:r>
-      <w:proofErr w:type="spellStart"/>
-      <w:r>
-        <w:t>MPI_Bcast</w:t>
-      </w:r>
-      <w:proofErr w:type="spellEnd"/>
-      <w:r>
-        <w:t xml:space="preserve">, поскольку её логарифмический алгоритм построен на нескольких последовательных раундах синхронизации между процессами: на каждом шаге дерева распространения группа процессов должна дождаться завершения предыдущего шага, прежде чем продолжить передачу дальше. При переподписке ядер вероятность того, что хотя бы один процесс из группы будет отложен планировщиком ОС на очередном шаге, кратно возрастает, а поскольку общее время выполнения коллективной операции определяется самым медленным участником на каждом из </w:t>
-      </w:r>
-      <w:proofErr w:type="spellStart"/>
-      <w:r>
-        <w:t>log</w:t>
-      </w:r>
-      <w:proofErr w:type="spellEnd"/>
-      <w:r>
-        <w:t xml:space="preserve"> P раундов, случайные задержки отдельных процессов накапливаются и многократно усиливают итоговое время выполнения. Реализация через </w:t>
-      </w:r>
-      <w:proofErr w:type="spellStart"/>
-      <w:r>
-        <w:t>point-to-point</w:t>
-      </w:r>
-      <w:proofErr w:type="spellEnd"/>
-      <w:r>
-        <w:t>, напротив, устроена как единственный плоский раунд рассылки: корневой процесс независимо и последовательно отправляет сообщения каждому получателю, а сами получатели не зависят друг от друга и не участвуют в промежуточной синхронизации между собой. Это делает данную конкретную реализацию менее чувствительной к переподписке ядер, поскольку задержка одного процесса-получателя не блокирует прогресс остальных.</w:t>
-      </w:r>
-    </w:p>
-    <w:p>
-      <w:r>
-        <w:t xml:space="preserve">Таким образом, результат при P=64 не опровергает общий вывод о превосходстве коллективных операций, а иллюстрирует важное дополнительное наблюдение: </w:t>
-      </w:r>
-      <w:r>
-        <w:lastRenderedPageBreak/>
-        <w:t xml:space="preserve">преимущество логарифмических алгоритмов коллективного обмена проявляется в первую очередь в условиях, когда число процессов не превышает число физически доступных вычислительных ядер. При выходе за пределы этого ограничения </w:t>
-      </w:r>
-      <w:proofErr w:type="spellStart"/>
-      <w:r>
-        <w:t>многораундовые</w:t>
-      </w:r>
-      <w:proofErr w:type="spellEnd"/>
-      <w:r>
-        <w:t xml:space="preserve"> алгоритмы синхронизации становятся уязвимы к системному шуму планирования операционной системы в большей степени, чем простые последовательные схемы обмена, и это стоит учитывать при выборе стратегии коммуникации для приложений, рассчитанных на работу в условиях ограниченных или разделяемых вычислительных ресурсов.</w:t>
-      </w:r>
-    </w:p>
+        <w:t>), в результате чего несколько процессов конкурируют за одни и те же вычислительные ресурсы и пропускную способность памяти, что нарушает предположение о полностью независимом параллельном выполнении, лежащее в основе идеальной модели масштабирования.</w:t>
+      </w:r>
+    </w:p>
+    <w:p>
+      <w:pPr>
+        <w:rPr>
+          <w:b/>
+          <w:bCs/>
+        </w:rPr>
+      </w:pPr>
+      <w:r>
+        <w:rPr>
+          <w:b/>
+          <w:bCs/>
+        </w:rPr>
+        <w:t>Заключение</w:t>
+      </w:r>
+    </w:p>
+    <w:p>
+      <w:r>
+        <w:t>Полученные результаты подтверждают корректность разработанного алгоритма и выбранной стратегии распределения данных: блочное разбиение матрицы по строкам обеспечивает равномерную нагрузку и демонстрирует масштабируемость, близкую к идеальной (и даже превосходящую её за счёт эффектов кэширования) при числе процессов, не превышающем количество физических вычислительных ядер системы. При превышении этого порога прирост производительности сохраняется в абсолютном выражении (время выполнения продолжает уменьшаться при увеличении P), однако эффективность использования дополнительных процессов заметно снижается вследствие конкуренции за общие аппаратные ресурсы. Для более точного определения границы, при которой параллелизм перестаёт давать пропорциональный выигрыш, целесообразно провести дополнительные измерения при промежуточных значениях P (например, 3, 5, 6, 16) и сопоставить полученную точку перегиба с числом физических ядер используемого процессора.</w:t>
+      </w:r>
+    </w:p>
+    <w:p/>
     <w:sectPr>
-      <w:footerReference w:type="even" r:id="rId11"/>
-      <w:footerReference w:type="default" r:id="rId12"/>
-      <w:footerReference w:type="first" r:id="rId13"/>
+      <w:footerReference w:type="even" r:id="rId12"/>
+      <w:footerReference w:type="default" r:id="rId13"/>
+      <w:footerReference w:type="first" r:id="rId14"/>
       <w:pgSz w:w="11906" w:h="16838"/>
       <w:pgMar w:top="720" w:right="720" w:bottom="720" w:left="720" w:header="0" w:footer="458" w:gutter="0"/>
       <w:cols w:space="720"/>
@@ -2506,6 +2541,155 @@
     </w:lvl>
   </w:abstractNum>
   <w:abstractNum w:abstractNumId="2" w15:restartNumberingAfterBreak="0">
+    <w:nsid w:val="6F5276AC"/>
+    <w:multiLevelType w:val="multilevel"/>
+    <w:tmpl w:val="F9FE1874"/>
+    <w:lvl w:ilvl="0">
+      <w:start w:val="1"/>
+      <w:numFmt w:val="bullet"/>
+      <w:lvlText w:val=""/>
+      <w:lvlJc w:val="left"/>
+      <w:pPr>
+        <w:tabs>
+          <w:tab w:val="num" w:pos="720"/>
+        </w:tabs>
+        <w:ind w:left="720" w:hanging="360"/>
+      </w:pPr>
+      <w:rPr>
+        <w:rFonts w:ascii="Symbol" w:hAnsi="Symbol" w:hint="default"/>
+        <w:sz w:val="20"/>
+      </w:rPr>
+    </w:lvl>
+    <w:lvl w:ilvl="1" w:tentative="1">
+      <w:start w:val="1"/>
+      <w:numFmt w:val="bullet"/>
+      <w:lvlText w:val="o"/>
+      <w:lvlJc w:val="left"/>
+      <w:pPr>
+        <w:tabs>
+          <w:tab w:val="num" w:pos="1440"/>
+        </w:tabs>
+        <w:ind w:left="1440" w:hanging="360"/>
+      </w:pPr>
+      <w:rPr>
+        <w:rFonts w:ascii="Courier New" w:hAnsi="Courier New" w:hint="default"/>
+        <w:sz w:val="20"/>
+      </w:rPr>
+    </w:lvl>
+    <w:lvl w:ilvl="2" w:tentative="1">
+      <w:start w:val="1"/>
+      <w:numFmt w:val="bullet"/>
+      <w:lvlText w:val=""/>
+      <w:lvlJc w:val="left"/>
+      <w:pPr>
+        <w:tabs>
+          <w:tab w:val="num" w:pos="2160"/>
+        </w:tabs>
+        <w:ind w:left="2160" w:hanging="360"/>
+      </w:pPr>
+      <w:rPr>
+        <w:rFonts w:ascii="Wingdings" w:hAnsi="Wingdings" w:hint="default"/>
+        <w:sz w:val="20"/>
+      </w:rPr>
+    </w:lvl>
+    <w:lvl w:ilvl="3" w:tentative="1">
+      <w:start w:val="1"/>
+      <w:numFmt w:val="bullet"/>
+      <w:lvlText w:val=""/>
+      <w:lvlJc w:val="left"/>
+      <w:pPr>
+        <w:tabs>
+          <w:tab w:val="num" w:pos="2880"/>
+        </w:tabs>
+        <w:ind w:left="2880" w:hanging="360"/>
+      </w:pPr>
+      <w:rPr>
+        <w:rFonts w:ascii="Wingdings" w:hAnsi="Wingdings" w:hint="default"/>
+        <w:sz w:val="20"/>
+      </w:rPr>
+    </w:lvl>
+    <w:lvl w:ilvl="4" w:tentative="1">
+      <w:start w:val="1"/>
+      <w:numFmt w:val="bullet"/>
+      <w:lvlText w:val=""/>
+      <w:lvlJc w:val="left"/>
+      <w:pPr>
+        <w:tabs>
+          <w:tab w:val="num" w:pos="3600"/>
+        </w:tabs>
+        <w:ind w:left="3600" w:hanging="360"/>
+      </w:pPr>
+      <w:rPr>
+        <w:rFonts w:ascii="Wingdings" w:hAnsi="Wingdings" w:hint="default"/>
+        <w:sz w:val="20"/>
+      </w:rPr>
+    </w:lvl>
+    <w:lvl w:ilvl="5" w:tentative="1">
+      <w:start w:val="1"/>
+      <w:numFmt w:val="bullet"/>
+      <w:lvlText w:val=""/>
+      <w:lvlJc w:val="left"/>
+      <w:pPr>
+        <w:tabs>
+          <w:tab w:val="num" w:pos="4320"/>
+        </w:tabs>
+        <w:ind w:left="4320" w:hanging="360"/>
+      </w:pPr>
+      <w:rPr>
+        <w:rFonts w:ascii="Wingdings" w:hAnsi="Wingdings" w:hint="default"/>
+        <w:sz w:val="20"/>
+      </w:rPr>
+    </w:lvl>
+    <w:lvl w:ilvl="6" w:tentative="1">
+      <w:start w:val="1"/>
+      <w:numFmt w:val="bullet"/>
+      <w:lvlText w:val=""/>
+      <w:lvlJc w:val="left"/>
+      <w:pPr>
+        <w:tabs>
+          <w:tab w:val="num" w:pos="5040"/>
+        </w:tabs>
+        <w:ind w:left="5040" w:hanging="360"/>
+      </w:pPr>
+      <w:rPr>
+        <w:rFonts w:ascii="Wingdings" w:hAnsi="Wingdings" w:hint="default"/>
+        <w:sz w:val="20"/>
+      </w:rPr>
+    </w:lvl>
+    <w:lvl w:ilvl="7" w:tentative="1">
+      <w:start w:val="1"/>
+      <w:numFmt w:val="bullet"/>
+      <w:lvlText w:val=""/>
+      <w:lvlJc w:val="left"/>
+      <w:pPr>
+        <w:tabs>
+          <w:tab w:val="num" w:pos="5760"/>
+        </w:tabs>
+        <w:ind w:left="5760" w:hanging="360"/>
+      </w:pPr>
+      <w:rPr>
+        <w:rFonts w:ascii="Wingdings" w:hAnsi="Wingdings" w:hint="default"/>
+        <w:sz w:val="20"/>
+      </w:rPr>
+    </w:lvl>
+    <w:lvl w:ilvl="8" w:tentative="1">
+      <w:start w:val="1"/>
+      <w:numFmt w:val="bullet"/>
+      <w:lvlText w:val=""/>
+      <w:lvlJc w:val="left"/>
+      <w:pPr>
+        <w:tabs>
+          <w:tab w:val="num" w:pos="6480"/>
+        </w:tabs>
+        <w:ind w:left="6480" w:hanging="360"/>
+      </w:pPr>
+      <w:rPr>
+        <w:rFonts w:ascii="Wingdings" w:hAnsi="Wingdings" w:hint="default"/>
+        <w:sz w:val="20"/>
+      </w:rPr>
+    </w:lvl>
+  </w:abstractNum>
+  <w:abstractNum w:abstractNumId="3" w15:restartNumberingAfterBreak="0">
     <w:nsid w:val="75DC3AE5"/>
     <w:multiLevelType w:val="multilevel"/>
     <w:tmpl w:val="3ED6F846"/>
@@ -2618,7 +2802,7 @@
       </w:pPr>
     </w:lvl>
   </w:abstractNum>
-  <w:abstractNum w:abstractNumId="3" w15:restartNumberingAfterBreak="0">
+  <w:abstractNum w:abstractNumId="4" w15:restartNumberingAfterBreak="0">
     <w:nsid w:val="7D4D4B30"/>
     <w:multiLevelType w:val="multilevel"/>
     <w:tmpl w:val="4A3A0882"/>
@@ -2740,7 +2924,7 @@
       </w:pPr>
     </w:lvl>
   </w:abstractNum>
-  <w:abstractNum w:abstractNumId="4" w15:restartNumberingAfterBreak="0">
+  <w:abstractNum w:abstractNumId="5" w15:restartNumberingAfterBreak="0">
     <w:nsid w:val="7E431BFE"/>
     <w:multiLevelType w:val="multilevel"/>
     <w:tmpl w:val="E4868A0A"/>
@@ -2859,21 +3043,24 @@
     </w:lvl>
   </w:abstractNum>
   <w:num w:numId="1" w16cid:durableId="1133405663">
-    <w:abstractNumId w:val="4"/>
+    <w:abstractNumId w:val="5"/>
   </w:num>
   <w:num w:numId="2" w16cid:durableId="1215048902">
     <w:abstractNumId w:val="1"/>
   </w:num>
   <w:num w:numId="3" w16cid:durableId="1986810188">
-    <w:abstractNumId w:val="3"/>
+    <w:abstractNumId w:val="4"/>
   </w:num>
   <w:num w:numId="4" w16cid:durableId="962924352">
-    <w:abstractNumId w:val="4"/>
+    <w:abstractNumId w:val="5"/>
   </w:num>
   <w:num w:numId="5" w16cid:durableId="1211111959">
     <w:abstractNumId w:val="0"/>
   </w:num>
   <w:num w:numId="6" w16cid:durableId="544560500">
+    <w:abstractNumId w:val="3"/>
+  </w:num>
+  <w:num w:numId="7" w16cid:durableId="807626320">
     <w:abstractNumId w:val="2"/>
   </w:num>
 </w:numbering>
@@ -4066,11 +4253,7 @@
             </a:pPr>
             <a:r>
               <a:rPr lang="ru-RU"/>
-              <a:t>Эффективность</a:t>
-            </a:r>
-            <a:r>
-              <a:rPr lang="ru-RU" baseline="0"/>
-              <a:t> двух реализации в зависимости от количества процессов</a:t>
+              <a:t>Эффективность программы в зависимости от количества процессов</a:t>
             </a:r>
           </a:p>
         </c:rich>
@@ -4119,7 +4302,7 @@
               <c:strCache>
                 <c:ptCount val="1"/>
                 <c:pt idx="0">
-                  <c:v>E_p2p (%)</c:v>
+                  <c:v>Efficiency E = S/P</c:v>
                 </c:pt>
               </c:strCache>
             </c:strRef>
@@ -4138,54 +4321,42 @@
           </c:marker>
           <c:cat>
             <c:numRef>
-              <c:f>Лист1!$A$2:$A$7</c:f>
+              <c:f>Лист1!$A$2:$A$5</c:f>
               <c:numCache>
                 <c:formatCode>General</c:formatCode>
-                <c:ptCount val="6"/>
+                <c:ptCount val="4"/>
                 <c:pt idx="0">
+                  <c:v>1</c:v>
+                </c:pt>
+                <c:pt idx="1">
                   <c:v>2</c:v>
                 </c:pt>
-                <c:pt idx="1">
+                <c:pt idx="2">
                   <c:v>4</c:v>
                 </c:pt>
-                <c:pt idx="2">
+                <c:pt idx="3">
                   <c:v>8</c:v>
-                </c:pt>
-                <c:pt idx="3">
-                  <c:v>16</c:v>
-                </c:pt>
-                <c:pt idx="4">
-                  <c:v>32</c:v>
-                </c:pt>
-                <c:pt idx="5">
-                  <c:v>64</c:v>
                 </c:pt>
               </c:numCache>
             </c:numRef>
           </c:cat>
           <c:val>
             <c:numRef>
-              <c:f>Лист1!$E$2:$E$7</c:f>
+              <c:f>Лист1!$E$2:$E$5</c:f>
               <c:numCache>
-                <c:formatCode>0.00</c:formatCode>
-                <c:ptCount val="6"/>
-                <c:pt idx="0">
-                  <c:v>100</c:v>
+                <c:formatCode>0.00%</c:formatCode>
+                <c:ptCount val="4"/>
+                <c:pt idx="0" formatCode="General">
+                  <c:v>1</c:v>
                 </c:pt>
                 <c:pt idx="1">
-                  <c:v>25.65</c:v>
+                  <c:v>1.0183</c:v>
                 </c:pt>
                 <c:pt idx="2">
-                  <c:v>4.72</c:v>
+                  <c:v>0.9677</c:v>
                 </c:pt>
                 <c:pt idx="3">
-                  <c:v>0</c:v>
-                </c:pt>
-                <c:pt idx="4">
-                  <c:v>0.15</c:v>
-                </c:pt>
-                <c:pt idx="5">
-                  <c:v>0.03</c:v>
+                  <c:v>0.60699999999999998</c:v>
                 </c:pt>
               </c:numCache>
             </c:numRef>
@@ -4193,94 +4364,7 @@
           <c:smooth val="0"/>
           <c:extLst>
             <c:ext xmlns:c16="http://schemas.microsoft.com/office/drawing/2014/chart" uri="{C3380CC4-5D6E-409C-BE32-E72D297353CC}">
-              <c16:uniqueId val="{00000000-A70A-4E51-9407-C12A8DB4A721}"/>
-            </c:ext>
-          </c:extLst>
-        </c:ser>
-        <c:ser>
-          <c:idx val="1"/>
-          <c:order val="1"/>
-          <c:tx>
-            <c:strRef>
-              <c:f>Лист1!$F$1</c:f>
-              <c:strCache>
-                <c:ptCount val="1"/>
-                <c:pt idx="0">
-                  <c:v>E_bcast (%)</c:v>
-                </c:pt>
-              </c:strCache>
-            </c:strRef>
-          </c:tx>
-          <c:spPr>
-            <a:ln w="28575" cap="rnd">
-              <a:solidFill>
-                <a:schemeClr val="accent2"/>
-              </a:solidFill>
-              <a:round/>
-            </a:ln>
-            <a:effectLst/>
-          </c:spPr>
-          <c:marker>
-            <c:symbol val="none"/>
-          </c:marker>
-          <c:cat>
-            <c:numRef>
-              <c:f>Лист1!$A$2:$A$7</c:f>
-              <c:numCache>
-                <c:formatCode>General</c:formatCode>
-                <c:ptCount val="6"/>
-                <c:pt idx="0">
-                  <c:v>2</c:v>
-                </c:pt>
-                <c:pt idx="1">
-                  <c:v>4</c:v>
-                </c:pt>
-                <c:pt idx="2">
-                  <c:v>8</c:v>
-                </c:pt>
-                <c:pt idx="3">
-                  <c:v>16</c:v>
-                </c:pt>
-                <c:pt idx="4">
-                  <c:v>32</c:v>
-                </c:pt>
-                <c:pt idx="5">
-                  <c:v>64</c:v>
-                </c:pt>
-              </c:numCache>
-            </c:numRef>
-          </c:cat>
-          <c:val>
-            <c:numRef>
-              <c:f>Лист1!$F$2:$F$7</c:f>
-              <c:numCache>
-                <c:formatCode>0.00</c:formatCode>
-                <c:ptCount val="6"/>
-                <c:pt idx="0">
-                  <c:v>100</c:v>
-                </c:pt>
-                <c:pt idx="1">
-                  <c:v>32.65</c:v>
-                </c:pt>
-                <c:pt idx="2">
-                  <c:v>8.77</c:v>
-                </c:pt>
-                <c:pt idx="3">
-                  <c:v>1.94</c:v>
-                </c:pt>
-                <c:pt idx="4">
-                  <c:v>0.39</c:v>
-                </c:pt>
-                <c:pt idx="5">
-                  <c:v>0.03</c:v>
-                </c:pt>
-              </c:numCache>
-            </c:numRef>
-          </c:val>
-          <c:smooth val="0"/>
-          <c:extLst>
-            <c:ext xmlns:c16="http://schemas.microsoft.com/office/drawing/2014/chart" uri="{C3380CC4-5D6E-409C-BE32-E72D297353CC}">
-              <c16:uniqueId val="{00000001-A70A-4E51-9407-C12A8DB4A721}"/>
+              <c16:uniqueId val="{00000000-4732-4CBC-8B9A-D93253BF8DEC}"/>
             </c:ext>
           </c:extLst>
         </c:ser>
@@ -4293,16 +4377,16 @@
           <c:showBubbleSize val="0"/>
         </c:dLbls>
         <c:smooth val="0"/>
-        <c:axId val="915730768"/>
-        <c:axId val="458403280"/>
+        <c:axId val="584757968"/>
+        <c:axId val="458983088"/>
       </c:lineChart>
       <c:catAx>
-        <c:axId val="915730768"/>
+        <c:axId val="584757968"/>
         <c:scaling>
           <c:orientation val="minMax"/>
         </c:scaling>
         <c:delete val="0"/>
-        <c:axPos val="t"/>
+        <c:axPos val="b"/>
         <c:numFmt formatCode="General" sourceLinked="1"/>
         <c:majorTickMark val="none"/>
         <c:minorTickMark val="none"/>
@@ -4340,7 +4424,7 @@
             <a:endParaRPr lang="ru-RU"/>
           </a:p>
         </c:txPr>
-        <c:crossAx val="458403280"/>
+        <c:crossAx val="458983088"/>
         <c:crosses val="autoZero"/>
         <c:auto val="1"/>
         <c:lblAlgn val="ctr"/>
@@ -4348,10 +4432,10 @@
         <c:noMultiLvlLbl val="0"/>
       </c:catAx>
       <c:valAx>
-        <c:axId val="458403280"/>
+        <c:axId val="458983088"/>
         <c:scaling>
-          <c:orientation val="maxMin"/>
-          <c:max val="100"/>
+          <c:orientation val="minMax"/>
+          <c:min val="0.60000000000000009"/>
         </c:scaling>
         <c:delete val="0"/>
         <c:axPos val="l"/>
@@ -4369,7 +4453,7 @@
             <a:effectLst/>
           </c:spPr>
         </c:majorGridlines>
-        <c:numFmt formatCode="0.00" sourceLinked="1"/>
+        <c:numFmt formatCode="General" sourceLinked="1"/>
         <c:majorTickMark val="none"/>
         <c:minorTickMark val="none"/>
         <c:tickLblPos val="nextTo"/>
@@ -4400,7 +4484,7 @@
             <a:endParaRPr lang="ru-RU"/>
           </a:p>
         </c:txPr>
-        <c:crossAx val="915730768"/>
+        <c:crossAx val="584757968"/>
         <c:crosses val="autoZero"/>
         <c:crossBetween val="between"/>
       </c:valAx>
@@ -4519,12 +4603,17 @@
               </a:defRPr>
             </a:pPr>
             <a:r>
-              <a:rPr lang="ru-RU" sz="1400" b="0" i="0" u="none" strike="noStrike" baseline="0">
-                <a:effectLst/>
-              </a:rPr>
-              <a:t>Время выполнения рассылки: point-to-point vs MPI_Bcast</a:t>
+              <a:rPr lang="ru-RU"/>
+              <a:t>Ускорение программы</a:t>
             </a:r>
-            <a:endParaRPr lang="ru-RU" baseline="0"/>
+            <a:r>
+              <a:rPr lang="en-US" baseline="0"/>
+              <a:t> </a:t>
+            </a:r>
+            <a:r>
+              <a:rPr lang="ru-RU"/>
+              <a:t>в зависимости от количества процессов</a:t>
+            </a:r>
           </a:p>
         </c:rich>
       </c:tx>
@@ -4568,11 +4657,11 @@
           <c:order val="0"/>
           <c:tx>
             <c:strRef>
-              <c:f>Лист1!$B$1</c:f>
+              <c:f>Лист1!$D$1</c:f>
               <c:strCache>
                 <c:ptCount val="1"/>
                 <c:pt idx="0">
-                  <c:v>T_p2p (сек)</c:v>
+                  <c:v>Speedup S = T1/Tp</c:v>
                 </c:pt>
               </c:strCache>
             </c:strRef>
@@ -4591,54 +4680,42 @@
           </c:marker>
           <c:cat>
             <c:numRef>
-              <c:f>Лист1!$A$2:$A$8</c:f>
+              <c:f>Лист1!$A$2:$A$5</c:f>
               <c:numCache>
                 <c:formatCode>General</c:formatCode>
-                <c:ptCount val="7"/>
+                <c:ptCount val="4"/>
                 <c:pt idx="0">
+                  <c:v>1</c:v>
+                </c:pt>
+                <c:pt idx="1">
                   <c:v>2</c:v>
                 </c:pt>
-                <c:pt idx="1">
+                <c:pt idx="2">
                   <c:v>4</c:v>
                 </c:pt>
-                <c:pt idx="2">
+                <c:pt idx="3">
                   <c:v>8</c:v>
-                </c:pt>
-                <c:pt idx="3">
-                  <c:v>16</c:v>
-                </c:pt>
-                <c:pt idx="4">
-                  <c:v>32</c:v>
-                </c:pt>
-                <c:pt idx="5">
-                  <c:v>64</c:v>
                 </c:pt>
               </c:numCache>
             </c:numRef>
           </c:cat>
           <c:val>
             <c:numRef>
-              <c:f>Лист1!$B$2:$B$7</c:f>
+              <c:f>Лист1!$D$2:$D$5</c:f>
               <c:numCache>
-                <c:formatCode>0.00</c:formatCode>
-                <c:ptCount val="6"/>
+                <c:formatCode>General</c:formatCode>
+                <c:ptCount val="4"/>
                 <c:pt idx="0">
-                  <c:v>2.0433E-2</c:v>
+                  <c:v>1</c:v>
                 </c:pt>
                 <c:pt idx="1">
-                  <c:v>3.9822999999999997E-2</c:v>
+                  <c:v>2.0369999999999999</c:v>
                 </c:pt>
                 <c:pt idx="2">
-                  <c:v>0.10821</c:v>
+                  <c:v>3.871</c:v>
                 </c:pt>
                 <c:pt idx="3">
-                  <c:v>0.33536500000000002</c:v>
-                </c:pt>
-                <c:pt idx="4">
-                  <c:v>0.84430300000000003</c:v>
-                </c:pt>
-                <c:pt idx="5">
-                  <c:v>1.837642</c:v>
+                  <c:v>4.8559999999999999</c:v>
                 </c:pt>
               </c:numCache>
             </c:numRef>
@@ -4646,94 +4723,7 @@
           <c:smooth val="0"/>
           <c:extLst>
             <c:ext xmlns:c16="http://schemas.microsoft.com/office/drawing/2014/chart" uri="{C3380CC4-5D6E-409C-BE32-E72D297353CC}">
-              <c16:uniqueId val="{00000000-422D-4525-A59A-A041906B5B96}"/>
-            </c:ext>
-          </c:extLst>
-        </c:ser>
-        <c:ser>
-          <c:idx val="1"/>
-          <c:order val="1"/>
-          <c:tx>
-            <c:strRef>
-              <c:f>Лист1!$C$1</c:f>
-              <c:strCache>
-                <c:ptCount val="1"/>
-                <c:pt idx="0">
-                  <c:v>T_bcast (сек)</c:v>
-                </c:pt>
-              </c:strCache>
-            </c:strRef>
-          </c:tx>
-          <c:spPr>
-            <a:ln w="28575" cap="rnd">
-              <a:solidFill>
-                <a:schemeClr val="accent2"/>
-              </a:solidFill>
-              <a:round/>
-            </a:ln>
-            <a:effectLst/>
-          </c:spPr>
-          <c:marker>
-            <c:symbol val="none"/>
-          </c:marker>
-          <c:cat>
-            <c:numRef>
-              <c:f>Лист1!$A$2:$A$8</c:f>
-              <c:numCache>
-                <c:formatCode>General</c:formatCode>
-                <c:ptCount val="7"/>
-                <c:pt idx="0">
-                  <c:v>2</c:v>
-                </c:pt>
-                <c:pt idx="1">
-                  <c:v>4</c:v>
-                </c:pt>
-                <c:pt idx="2">
-                  <c:v>8</c:v>
-                </c:pt>
-                <c:pt idx="3">
-                  <c:v>16</c:v>
-                </c:pt>
-                <c:pt idx="4">
-                  <c:v>32</c:v>
-                </c:pt>
-                <c:pt idx="5">
-                  <c:v>64</c:v>
-                </c:pt>
-              </c:numCache>
-            </c:numRef>
-          </c:cat>
-          <c:val>
-            <c:numRef>
-              <c:f>Лист1!$C$2:$C$7</c:f>
-              <c:numCache>
-                <c:formatCode>0.00</c:formatCode>
-                <c:ptCount val="6"/>
-                <c:pt idx="0">
-                  <c:v>1.9394999999999999E-2</c:v>
-                </c:pt>
-                <c:pt idx="1">
-                  <c:v>2.9699E-2</c:v>
-                </c:pt>
-                <c:pt idx="2">
-                  <c:v>5.5306000000000001E-2</c:v>
-                </c:pt>
-                <c:pt idx="3">
-                  <c:v>0.124698</c:v>
-                </c:pt>
-                <c:pt idx="4">
-                  <c:v>0.31226399999999999</c:v>
-                </c:pt>
-                <c:pt idx="5">
-                  <c:v>2.170725</c:v>
-                </c:pt>
-              </c:numCache>
-            </c:numRef>
-          </c:val>
-          <c:smooth val="0"/>
-          <c:extLst>
-            <c:ext xmlns:c16="http://schemas.microsoft.com/office/drawing/2014/chart" uri="{C3380CC4-5D6E-409C-BE32-E72D297353CC}">
-              <c16:uniqueId val="{00000001-422D-4525-A59A-A041906B5B96}"/>
+              <c16:uniqueId val="{00000000-709A-4B9A-9D61-E89E55B26EF1}"/>
             </c:ext>
           </c:extLst>
         </c:ser>
@@ -4746,11 +4736,11 @@
           <c:showBubbleSize val="0"/>
         </c:dLbls>
         <c:smooth val="0"/>
-        <c:axId val="915730768"/>
-        <c:axId val="458403280"/>
+        <c:axId val="584757968"/>
+        <c:axId val="458983088"/>
       </c:lineChart>
       <c:catAx>
-        <c:axId val="915730768"/>
+        <c:axId val="584757968"/>
         <c:scaling>
           <c:orientation val="minMax"/>
         </c:scaling>
@@ -4793,7 +4783,7 @@
             <a:endParaRPr lang="ru-RU"/>
           </a:p>
         </c:txPr>
-        <c:crossAx val="458403280"/>
+        <c:crossAx val="458983088"/>
         <c:crosses val="autoZero"/>
         <c:auto val="1"/>
         <c:lblAlgn val="ctr"/>
@@ -4801,11 +4791,10 @@
         <c:noMultiLvlLbl val="0"/>
       </c:catAx>
       <c:valAx>
-        <c:axId val="458403280"/>
+        <c:axId val="458983088"/>
         <c:scaling>
           <c:orientation val="minMax"/>
-          <c:max val="2.2000000000000002"/>
-          <c:min val="0"/>
+          <c:min val="0.60000000000000009"/>
         </c:scaling>
         <c:delete val="0"/>
         <c:axPos val="l"/>
@@ -4823,7 +4812,7 @@
             <a:effectLst/>
           </c:spPr>
         </c:majorGridlines>
-        <c:numFmt formatCode="0.00" sourceLinked="1"/>
+        <c:numFmt formatCode="General" sourceLinked="1"/>
         <c:majorTickMark val="none"/>
         <c:minorTickMark val="none"/>
         <c:tickLblPos val="nextTo"/>
@@ -4854,7 +4843,7 @@
             <a:endParaRPr lang="ru-RU"/>
           </a:p>
         </c:txPr>
-        <c:crossAx val="915730768"/>
+        <c:crossAx val="584757968"/>
         <c:crosses val="autoZero"/>
         <c:crossBetween val="between"/>
       </c:valAx>

</xml_diff>